<commit_message>
feat: scale and harden LTR consensus building
</commit_message>
<xml_diff>
--- a/docx/PAN_TE_METHODS_ZH.docx
+++ b/docx/PAN_TE_METHODS_ZH.docx
@@ -57,8 +57,6 @@
       </w:r>
       <w:r>
         <w:tab/>
-      </w:r>
-      <w:r>
         <w:t xml:space="preserve">文档定位与方法学边界</w:t>
       </w:r>
     </w:p>
@@ -67,10 +65,7 @@
         <w:pStyle w:val="FirstParagraph"/>
       </w:pPr>
       <w:r>
-        <w:t xml:space="preserve">本文档描述 Pan_TE 当前可执行代码所采用的数据处理流程、算法、参数、质量控制和输出契约，可作为论文 Materials and Methods、软件方法说明和补充方法的事实来源。所有算法描述均以仓库中的</w:t>
-      </w:r>
-      <w:r>
-        <w:t xml:space="preserve"> </w:t>
+        <w:t xml:space="preserve">本文档描述 Pan_TE 当前可执行代码所采用的数据处理流程、算法、参数、质量控制和输出契约，可作为论文 Materials and Methods、软件方法说明和补充方法的事实来源。所有算法描述均以仓库中的 </w:t>
       </w:r>
       <w:r>
         <w:rPr>
@@ -124,13 +119,7 @@
         <w:t xml:space="preserve">bin/Refiner_mdl/</w:t>
       </w:r>
       <w:r>
-        <w:t xml:space="preserve"> </w:t>
-      </w:r>
-      <w:r>
-        <w:t xml:space="preserve">及所调用的</w:t>
-      </w:r>
-      <w:r>
-        <w:t xml:space="preserve"> </w:t>
+        <w:t xml:space="preserve"> 及所调用的 </w:t>
       </w:r>
       <w:r>
         <w:rPr>
@@ -139,10 +128,7 @@
         <w:t xml:space="preserve">dtr</w:t>
       </w:r>
       <w:r>
-        <w:t xml:space="preserve"> </w:t>
-      </w:r>
-      <w:r>
-        <w:t xml:space="preserve">命令为准。</w:t>
+        <w:t xml:space="preserve"> 命令为准。</w:t>
       </w:r>
     </w:p>
     <w:p>
@@ -158,10 +144,7 @@
         <w:pStyle w:val="BodyText"/>
       </w:pPr>
       <w:r>
-        <w:t xml:space="preserve">TE-looker 的生产输出由</w:t>
-      </w:r>
-      <w:r>
-        <w:t xml:space="preserve"> </w:t>
+        <w:t xml:space="preserve">TE-looker 的生产输出由 </w:t>
       </w:r>
       <w:r>
         <w:rPr>
@@ -170,13 +153,7 @@
         <w:t xml:space="preserve">dtr run</w:t>
       </w:r>
       <w:r>
-        <w:t xml:space="preserve"> </w:t>
-      </w:r>
-      <w:r>
-        <w:t xml:space="preserve">及其门控契约决定。只有声明</w:t>
-      </w:r>
-      <w:r>
-        <w:t xml:space="preserve"> </w:t>
+        <w:t xml:space="preserve"> 及其门控契约决定。只有声明 </w:t>
       </w:r>
       <w:r>
         <w:rPr>
@@ -194,13 +171,7 @@
         <w:t xml:space="preserve">mode=gated</w:t>
       </w:r>
       <w:r>
-        <w:t xml:space="preserve"> </w:t>
-      </w:r>
-      <w:r>
-        <w:t xml:space="preserve">且</w:t>
-      </w:r>
-      <w:r>
-        <w:t xml:space="preserve"> </w:t>
+        <w:t xml:space="preserve"> 且 </w:t>
       </w:r>
       <w:r>
         <w:rPr>
@@ -209,10 +180,7 @@
         <w:t xml:space="preserve">final_library=families.fasta</w:t>
       </w:r>
       <w:r>
-        <w:t xml:space="preserve"> </w:t>
-      </w:r>
-      <w:r>
-        <w:t xml:space="preserve">的 provenance 才被直接接纳。没有该契约时，Pan_TE 对发现结果执行片段拼接、长度和成员数门控以及轨道内去冗余。Track 2 的窗口图、LSH、社区、POA、non-TE 守卫、copy catalog、结构审计和 G1–G6 审计输出属于部分证据链，</w:t>
+        <w:t xml:space="preserve"> 的 provenance 才被直接接纳。没有该契约时，Pan_TE 对发现结果执行片段拼接、长度和成员数门控以及轨道内去冗余。Track 2 的窗口图、LSH、社区、POA、non-TE 守卫、copy catalog、结构审计和 G1–G6 审计输出属于部分证据链，</w:t>
       </w:r>
       <w:r>
         <w:rPr>
@@ -238,8 +206,6 @@
       </w:r>
       <w:r>
         <w:tab/>
-      </w:r>
-      <w:r>
         <w:t xml:space="preserve">1. 软件输入、运行模式与总体流程</w:t>
       </w:r>
     </w:p>
@@ -256,8 +222,6 @@
       </w:r>
       <w:r>
         <w:tab/>
-      </w:r>
-      <w:r>
         <w:t xml:space="preserve">1.1 输入模式</w:t>
       </w:r>
     </w:p>
@@ -278,10 +242,7 @@
         </w:numPr>
       </w:pPr>
       <w:r>
-        <w:t xml:space="preserve">单基因组模式使用</w:t>
-      </w:r>
-      <w:r>
-        <w:t xml:space="preserve"> </w:t>
+        <w:t xml:space="preserve">单基因组模式使用 </w:t>
       </w:r>
       <w:r>
         <w:rPr>
@@ -302,10 +263,7 @@
         </w:numPr>
       </w:pPr>
       <w:r>
-        <w:t xml:space="preserve">PAF 泛基因组模式使用</w:t>
-      </w:r>
-      <w:r>
-        <w:t xml:space="preserve"> </w:t>
+        <w:t xml:space="preserve">PAF 泛基因组模式使用 </w:t>
       </w:r>
       <w:r>
         <w:rPr>
@@ -326,10 +284,7 @@
         </w:numPr>
       </w:pPr>
       <w:r>
-        <w:t xml:space="preserve">GFA 泛基因组模式使用</w:t>
-      </w:r>
-      <w:r>
-        <w:t xml:space="preserve"> </w:t>
+        <w:t xml:space="preserve">GFA 泛基因组模式使用 </w:t>
       </w:r>
       <w:r>
         <w:rPr>
@@ -338,10 +293,7 @@
         <w:t xml:space="preserve">--gfa graph.gfa</w:t>
       </w:r>
       <w:r>
-        <w:t xml:space="preserve">。PGGB/smoothxg 图由内嵌 P/W 路径恢复样本等位序列；minigraph rGFA 由</w:t>
-      </w:r>
-      <w:r>
-        <w:t xml:space="preserve"> </w:t>
+        <w:t xml:space="preserve">。PGGB/smoothxg 图由内嵌 P/W 路径恢复样本等位序列；minigraph rGFA 由 </w:t>
       </w:r>
       <w:r>
         <w:rPr>
@@ -350,10 +302,7 @@
         <w:t xml:space="preserve">SR/SN/SO</w:t>
       </w:r>
       <w:r>
-        <w:t xml:space="preserve"> </w:t>
-      </w:r>
-      <w:r>
-        <w:t xml:space="preserve">标签和 primary GAF 恢复样本 traversal。</w:t>
+        <w:t xml:space="preserve"> 标签和 primary GAF 恢复样本 traversal。</w:t>
       </w:r>
     </w:p>
     <w:p>
@@ -382,13 +331,7 @@
         <w:t xml:space="preserve">--anno-only --gfa graph.gfa --anno-manifest annotations.tsv</w:t>
       </w:r>
       <w:r>
-        <w:t xml:space="preserve"> </w:t>
-      </w:r>
-      <w:r>
-        <w:t xml:space="preserve">将所有组装已有的 RepeatMasker、BED 或 GFF3 注释投影到图节点，不调用 RepeatMasker，也不依赖</w:t>
-      </w:r>
-      <w:r>
-        <w:t xml:space="preserve"> </w:t>
+        <w:t xml:space="preserve"> 将所有组装已有的 RepeatMasker、BED 或 GFF3 注释投影到图节点，不调用 RepeatMasker，也不依赖 </w:t>
       </w:r>
       <w:r>
         <w:rPr>
@@ -414,8 +357,6 @@
       </w:r>
       <w:r>
         <w:tab/>
-      </w:r>
-      <w:r>
         <w:t xml:space="preserve">1.2 阶段依赖关系</w:t>
       </w:r>
     </w:p>
@@ -497,10 +438,7 @@
         <w:pStyle w:val="FirstParagraph"/>
       </w:pPr>
       <w:r>
-        <w:t xml:space="preserve">Look4LTRs 与 mdl-repeat 由两个任务并行运行。TE-looker 位于二者之后，因为其 HMM 输入可以由 Refiner_mdl 的 masking consensus 构建。阶段完成状态由</w:t>
-      </w:r>
-      <w:r>
-        <w:t xml:space="preserve"> </w:t>
+        <w:t xml:space="preserve">Look4LTRs 与 mdl-repeat 由两个任务并行运行。TE-looker 位于二者之后，因为其 HMM 输入可以由 Refiner_mdl 的 masking consensus 构建。阶段完成状态由 </w:t>
       </w:r>
       <w:r>
         <w:rPr>
@@ -545,13 +483,7 @@
         <w:t xml:space="preserve">combine.ok</w:t>
       </w:r>
       <w:r>
-        <w:t xml:space="preserve"> </w:t>
-      </w:r>
-      <w:r>
-        <w:t xml:space="preserve">和</w:t>
-      </w:r>
-      <w:r>
-        <w:t xml:space="preserve"> </w:t>
+        <w:t xml:space="preserve"> 和 </w:t>
       </w:r>
       <w:r>
         <w:rPr>
@@ -560,10 +492,7 @@
         <w:t xml:space="preserve">anno.ok</w:t>
       </w:r>
       <w:r>
-        <w:t xml:space="preserve"> </w:t>
-      </w:r>
-      <w:r>
-        <w:t xml:space="preserve">表示。GFA 发现模式额外保存输入路径、文件大小、mtime、图模式、GAF 路径和阈值指纹；指纹不一致时不复用旧的基因组阶段检查点。</w:t>
+        <w:t xml:space="preserve"> 表示。GFA 发现模式额外保存输入路径、文件大小、mtime、图模式、GAF 路径和阈值指纹；指纹不一致时不复用旧的基因组阶段检查点。</w:t>
       </w:r>
     </w:p>
     <w:bookmarkEnd w:id="22"/>
@@ -580,8 +509,6 @@
       </w:r>
       <w:r>
         <w:tab/>
-      </w:r>
-      <w:r>
         <w:t xml:space="preserve">1.3 坐标与标识符约定</w:t>
       </w:r>
     </w:p>
@@ -590,10 +517,7 @@
         <w:pStyle w:val="FirstParagraph"/>
       </w:pPr>
       <w:r>
-        <w:t xml:space="preserve">内部 BED、PAF、GAF、occurrence 和投影 TSV 均采用 0-based、half-open 区间</w:t>
-      </w:r>
-      <w:r>
-        <w:t xml:space="preserve"> </w:t>
+        <w:t xml:space="preserve">内部 BED、PAF、GAF、occurrence 和投影 TSV 均采用 0-based、half-open 区间 </w:t>
       </w:r>
       <m:oMath>
         <m:r>
@@ -622,10 +546,7 @@
         </m:r>
       </m:oMath>
       <w:r>
-        <w:t xml:space="preserve">，长度为</w:t>
-      </w:r>
-      <w:r>
-        <w:t xml:space="preserve"> </w:t>
+        <w:t xml:space="preserve">，长度为 </w:t>
       </w:r>
       <m:oMath>
         <m:r>
@@ -642,10 +563,7 @@
         </m:r>
       </m:oMath>
       <w:r>
-        <w:t xml:space="preserve">。GFF3 输入由 1-based inclusive 转为内部区间</w:t>
-      </w:r>
-      <w:r>
-        <w:t xml:space="preserve"> </w:t>
+        <w:t xml:space="preserve">。GFF3 输入由 1-based inclusive 转为内部区间 </w:t>
       </w:r>
       <m:oMath>
         <m:r>
@@ -655,19 +573,7 @@
           <m:t>[</m:t>
         </m:r>
         <m:r>
-          <m:t>s</m:t>
-        </m:r>
-        <m:r>
-          <m:t>t</m:t>
-        </m:r>
-        <m:r>
-          <m:t>a</m:t>
-        </m:r>
-        <m:r>
-          <m:t>r</m:t>
-        </m:r>
-        <m:r>
-          <m:t>t</m:t>
+          <m:t>start</m:t>
         </m:r>
         <m:r>
           <m:rPr>
@@ -685,13 +591,7 @@
           <m:t>,</m:t>
         </m:r>
         <m:r>
-          <m:t>e</m:t>
-        </m:r>
-        <m:r>
-          <m:t>n</m:t>
-        </m:r>
-        <m:r>
-          <m:t>d</m:t>
+          <m:t>end</m:t>
         </m:r>
         <m:r>
           <m:rPr>
@@ -701,10 +601,7 @@
         </m:r>
       </m:oMath>
       <w:r>
-        <w:t xml:space="preserve">，输出 node-local GFF3 时再转换回 1-based inclusive。RepeatMasker</w:t>
-      </w:r>
-      <w:r>
-        <w:t xml:space="preserve"> </w:t>
+        <w:t xml:space="preserve">，输出 node-local GFF3 时再转换回 1-based inclusive。RepeatMasker </w:t>
       </w:r>
       <w:r>
         <w:rPr>
@@ -713,13 +610,7 @@
         <w:t xml:space="preserve">.out</w:t>
       </w:r>
       <w:r>
-        <w:t xml:space="preserve"> </w:t>
-      </w:r>
-      <w:r>
-        <w:t xml:space="preserve">的</w:t>
-      </w:r>
-      <w:r>
-        <w:t xml:space="preserve"> </w:t>
+        <w:t xml:space="preserve"> 的 </w:t>
       </w:r>
       <w:r>
         <w:rPr>
@@ -728,13 +619,7 @@
         <w:t xml:space="preserve">query_begin/query_end</w:t>
       </w:r>
       <w:r>
-        <w:t xml:space="preserve"> </w:t>
-      </w:r>
-      <w:r>
-        <w:t xml:space="preserve">同样转换为</w:t>
-      </w:r>
-      <w:r>
-        <w:t xml:space="preserve"> </w:t>
+        <w:t xml:space="preserve"> 同样转换为 </w:t>
       </w:r>
       <m:oMath>
         <m:r>
@@ -744,19 +629,7 @@
           <m:t>[</m:t>
         </m:r>
         <m:r>
-          <m:t>b</m:t>
-        </m:r>
-        <m:r>
-          <m:t>e</m:t>
-        </m:r>
-        <m:r>
-          <m:t>g</m:t>
-        </m:r>
-        <m:r>
-          <m:t>i</m:t>
-        </m:r>
-        <m:r>
-          <m:t>n</m:t>
+          <m:t>begin</m:t>
         </m:r>
         <m:r>
           <m:rPr>
@@ -774,13 +647,7 @@
           <m:t>,</m:t>
         </m:r>
         <m:r>
-          <m:t>e</m:t>
-        </m:r>
-        <m:r>
-          <m:t>n</m:t>
-        </m:r>
-        <m:r>
-          <m:t>d</m:t>
+          <m:t>end</m:t>
         </m:r>
         <m:r>
           <m:rPr>
@@ -790,10 +657,7 @@
         </m:r>
       </m:oMath>
       <w:r>
-        <w:t xml:space="preserve">。调用</w:t>
-      </w:r>
-      <w:r>
-        <w:t xml:space="preserve"> </w:t>
+        <w:t xml:space="preserve">。调用 </w:t>
       </w:r>
       <w:r>
         <w:rPr>
@@ -802,13 +666,7 @@
         <w:t xml:space="preserve">samtools faidx</w:t>
       </w:r>
       <w:r>
-        <w:t xml:space="preserve"> </w:t>
-      </w:r>
-      <w:r>
-        <w:t xml:space="preserve">时使用 1-based inclusive 区间</w:t>
-      </w:r>
-      <w:r>
-        <w:t xml:space="preserve"> </w:t>
+        <w:t xml:space="preserve"> 时使用 1-based inclusive 区间 </w:t>
       </w:r>
       <w:r>
         <w:rPr>
@@ -834,10 +692,7 @@
         <w:t xml:space="preserve">sample#haplotype#contig</w:t>
       </w:r>
       <w:r>
-        <w:t xml:space="preserve">。manifest 中的</w:t>
-      </w:r>
-      <w:r>
-        <w:t xml:space="preserve"> </w:t>
+        <w:t xml:space="preserve">。manifest 中的 </w:t>
       </w:r>
       <w:r>
         <w:rPr>
@@ -846,10 +701,7 @@
         <w:t xml:space="preserve">(sample,haplotype)</w:t>
       </w:r>
       <w:r>
-        <w:t xml:space="preserve"> </w:t>
-      </w:r>
-      <w:r>
-        <w:t xml:space="preserve">是样本主键；</w:t>
+        <w:t xml:space="preserve"> 是样本主键；</w:t>
       </w:r>
       <w:r>
         <w:rPr>
@@ -858,10 +710,7 @@
         <w:t xml:space="preserve">seqid_map</w:t>
       </w:r>
       <w:r>
-        <w:t xml:space="preserve"> </w:t>
-      </w:r>
-      <w:r>
-        <w:t xml:space="preserve">用于显式连接注释 seqid 和图路径 contig。所有自动名称匹配都保留 unresolved 审计，歧义匹配不作猜测。</w:t>
+        <w:t xml:space="preserve"> 用于显式连接注释 seqid 和图路径 contig。所有自动名称匹配都保留 unresolved 审计，歧义匹配不作猜测。</w:t>
       </w:r>
     </w:p>
     <w:bookmarkEnd w:id="23"/>
@@ -879,8 +728,6 @@
       </w:r>
       <w:r>
         <w:tab/>
-      </w:r>
-      <w:r>
         <w:t xml:space="preserve">2. 环境预检、资源控制与输入规范化</w:t>
       </w:r>
     </w:p>
@@ -897,8 +744,6 @@
       </w:r>
       <w:r>
         <w:tab/>
-      </w:r>
-      <w:r>
         <w:t xml:space="preserve">2.1 环境预检</w:t>
       </w:r>
     </w:p>
@@ -916,10 +761,7 @@
         <w:t xml:space="preserve">--anno-only</w:t>
       </w:r>
       <w:r>
-        <w:t xml:space="preserve"> </w:t>
-      </w:r>
-      <w:r>
-        <w:t xml:space="preserve">只读取已有注释，因此不要求 RepeatMasker 可执行文件。</w:t>
+        <w:t xml:space="preserve"> 只读取已有注释，因此不要求 RepeatMasker 可执行文件。</w:t>
       </w:r>
     </w:p>
     <w:p>
@@ -927,10 +769,7 @@
         <w:pStyle w:val="BodyText"/>
       </w:pPr>
       <w:r>
-        <w:t xml:space="preserve">可用内存取以下上限中的最小值：命令行</w:t>
-      </w:r>
-      <w:r>
-        <w:t xml:space="preserve"> </w:t>
+        <w:t xml:space="preserve">可用内存取以下上限中的最小值：命令行 </w:t>
       </w:r>
       <w:r>
         <w:rPr>
@@ -939,10 +778,7 @@
         <w:t xml:space="preserve">-M</w:t>
       </w:r>
       <w:r>
-        <w:t xml:space="preserve">、cgroup 限制、SLURM 分配和</w:t>
-      </w:r>
-      <w:r>
-        <w:t xml:space="preserve"> </w:t>
+        <w:t xml:space="preserve">、cgroup 限制、SLURM 分配和 </w:t>
       </w:r>
       <w:r>
         <w:rPr>
@@ -979,16 +815,7 @@
             </m:e>
             <m:sub>
               <m:r>
-                <m:t>p</m:t>
-              </m:r>
-              <m:r>
-                <m:t>e</m:t>
-              </m:r>
-              <m:r>
-                <m:t>a</m:t>
-              </m:r>
-              <m:r>
-                <m:t>k</m:t>
+                <m:t>peak</m:t>
               </m:r>
             </m:sub>
           </m:sSub>
@@ -1019,13 +846,7 @@
                 <m:t>+</m:t>
               </m:r>
               <m:r>
-                <m:t>16</m:t>
-              </m:r>
-              <m:r>
-                <m:t>G</m:t>
-              </m:r>
-              <m:r>
-                <m:t>ρ</m:t>
+                <m:t>16Gρ</m:t>
               </m:r>
               <m:d>
                 <m:dPr>
@@ -1053,10 +874,7 @@
         <w:pStyle w:val="FirstParagraph"/>
       </w:pPr>
       <w:r>
-        <w:t xml:space="preserve">其中</w:t>
-      </w:r>
-      <w:r>
-        <w:t xml:space="preserve"> </w:t>
+        <w:t xml:space="preserve">其中 </w:t>
       </w:r>
       <m:oMath>
         <m:r>
@@ -1064,10 +882,7 @@
         </m:r>
       </m:oMath>
       <w:r>
-        <w:t xml:space="preserve"> </w:t>
-      </w:r>
-      <w:r>
-        <w:t xml:space="preserve">为基因组 bp 数，</w:t>
+        <w:t xml:space="preserve"> 为基因组 bp 数，</w:t>
       </w:r>
       <m:oMath>
         <m:r>
@@ -1075,10 +890,7 @@
         </m:r>
       </m:oMath>
       <w:r>
-        <w:t xml:space="preserve"> </w:t>
-      </w:r>
-      <w:r>
-        <w:t xml:space="preserve">为 minimizer window，</w:t>
+        <w:t xml:space="preserve"> 为 minimizer window，</w:t>
       </w:r>
       <m:oMath>
         <m:r>
@@ -1125,10 +937,7 @@
         </m:r>
       </m:oMath>
       <w:r>
-        <w:t xml:space="preserve">）或</w:t>
-      </w:r>
-      <w:r>
-        <w:t xml:space="preserve"> </w:t>
+        <w:t xml:space="preserve">）或 </w:t>
       </w:r>
       <m:oMath>
         <m:r>
@@ -1189,10 +998,7 @@
         </m:r>
       </m:oMath>
       <w:r>
-        <w:t xml:space="preserve"> </w:t>
-      </w:r>
-      <w:r>
-        <w:t xml:space="preserve">为内存副本数。</w:t>
+        <w:t xml:space="preserve"> 为内存副本数。</w:t>
       </w:r>
       <w:r>
         <w:rPr>
@@ -1201,13 +1007,7 @@
         <w:t xml:space="preserve">dtr</w:t>
       </w:r>
       <w:r>
-        <w:t xml:space="preserve"> </w:t>
-      </w:r>
-      <w:r>
-        <w:t xml:space="preserve">版本无法识别或版本低于 0.3.1 时取</w:t>
-      </w:r>
-      <w:r>
-        <w:t xml:space="preserve"> </w:t>
+        <w:t xml:space="preserve"> 版本无法识别或版本低于 0.3.1 时取 </w:t>
       </w:r>
       <m:oMath>
         <m:r>
@@ -1224,10 +1024,7 @@
         </m:r>
       </m:oMath>
       <w:r>
-        <w:t xml:space="preserve">，版本不低于 0.3.1 时取</w:t>
-      </w:r>
-      <w:r>
-        <w:t xml:space="preserve"> </w:t>
+        <w:t xml:space="preserve">，版本不低于 0.3.1 时取 </w:t>
       </w:r>
       <m:oMath>
         <m:r>
@@ -1244,10 +1041,7 @@
         </m:r>
       </m:oMath>
       <w:r>
-        <w:t xml:space="preserve">。估算值超过可用上限时流程在 seed harvest 前终止，并报告所需内存和显式可选的</w:t>
-      </w:r>
-      <w:r>
-        <w:t xml:space="preserve"> </w:t>
+        <w:t xml:space="preserve">。估算值超过可用上限时流程在 seed harvest 前终止，并报告所需内存和显式可选的 </w:t>
       </w:r>
       <m:oMath>
         <m:r>
@@ -1255,10 +1049,7 @@
         </m:r>
       </m:oMath>
       <w:r>
-        <w:t xml:space="preserve">；流程不自动改变</w:t>
-      </w:r>
-      <w:r>
-        <w:t xml:space="preserve"> </w:t>
+        <w:t xml:space="preserve">；流程不自动改变 </w:t>
       </w:r>
       <m:oMath>
         <m:r>
@@ -1266,10 +1057,7 @@
         </m:r>
       </m:oMath>
       <w:r>
-        <w:t xml:space="preserve">，因为改变</w:t>
-      </w:r>
-      <w:r>
-        <w:t xml:space="preserve"> </w:t>
+        <w:t xml:space="preserve">，因为改变 </w:t>
       </w:r>
       <m:oMath>
         <m:r>
@@ -1277,10 +1065,7 @@
         </m:r>
       </m:oMath>
       <w:r>
-        <w:t xml:space="preserve"> </w:t>
-      </w:r>
-      <w:r>
-        <w:t xml:space="preserve">会改变种子集合。</w:t>
+        <w:t xml:space="preserve"> 会改变种子集合。</w:t>
       </w:r>
     </w:p>
     <w:bookmarkEnd w:id="25"/>
@@ -1297,8 +1082,6 @@
       </w:r>
       <w:r>
         <w:tab/>
-      </w:r>
-      <w:r>
         <w:t xml:space="preserve">2.2 FASTA 规范化</w:t>
       </w:r>
     </w:p>
@@ -1313,13 +1096,7 @@
         <w:t xml:space="preserve">clean_seq_fast</w:t>
       </w:r>
       <w:r>
-        <w:t xml:space="preserve"> </w:t>
-      </w:r>
-      <w:r>
-        <w:t xml:space="preserve">以流式方式读取 FASTA，将序列转为大写，并把非</w:t>
-      </w:r>
-      <w:r>
-        <w:t xml:space="preserve"> </w:t>
+        <w:t xml:space="preserve"> 以流式方式读取 FASTA，将序列转为大写，并把非 </w:t>
       </w:r>
       <w:r>
         <w:rPr>
@@ -1328,13 +1105,7 @@
         <w:t xml:space="preserve">A/C/G/T/N</w:t>
       </w:r>
       <w:r>
-        <w:t xml:space="preserve"> </w:t>
-      </w:r>
-      <w:r>
-        <w:t xml:space="preserve">的退化碱基替换为</w:t>
-      </w:r>
-      <w:r>
-        <w:t xml:space="preserve"> </w:t>
+        <w:t xml:space="preserve"> 的退化碱基替换为 </w:t>
       </w:r>
       <w:r>
         <w:rPr>
@@ -1343,10 +1114,7 @@
         <w:t xml:space="preserve">N</w:t>
       </w:r>
       <w:r>
-        <w:t xml:space="preserve">。内部 contig 统一命名为</w:t>
-      </w:r>
-      <w:r>
-        <w:t xml:space="preserve"> </w:t>
+        <w:t xml:space="preserve">。内部 contig 统一命名为 </w:t>
       </w:r>
       <w:r>
         <w:rPr>
@@ -1355,10 +1123,7 @@
         <w:t xml:space="preserve">chr1...chrN</w:t>
       </w:r>
       <w:r>
-        <w:t xml:space="preserve">，随后使用</w:t>
-      </w:r>
-      <w:r>
-        <w:t xml:space="preserve"> </w:t>
+        <w:t xml:space="preserve">，随后使用 </w:t>
       </w:r>
       <w:r>
         <w:rPr>
@@ -1367,10 +1132,7 @@
         <w:t xml:space="preserve">samtools faidx</w:t>
       </w:r>
       <w:r>
-        <w:t xml:space="preserve"> </w:t>
-      </w:r>
-      <w:r>
-        <w:t xml:space="preserve">和项目索引程序建立随机访问索引。原始标识符与内部标识符的关系通过输入映射和 manifest 保存。</w:t>
+        <w:t xml:space="preserve"> 和项目索引程序建立随机访问索引。原始标识符与内部标识符的关系通过输入映射和 manifest 保存。</w:t>
       </w:r>
     </w:p>
     <w:bookmarkEnd w:id="26"/>
@@ -1387,8 +1149,6 @@
       </w:r>
       <w:r>
         <w:tab/>
-      </w:r>
-      <w:r>
         <w:t xml:space="preserve">2.3 VCF 插入序列富集</w:t>
       </w:r>
     </w:p>
@@ -1397,10 +1157,7 @@
         <w:pStyle w:val="FirstParagraph"/>
       </w:pPr>
       <w:r>
-        <w:t xml:space="preserve">VCF 模式只提取具有显式核苷酸序列的插入。非符号 ALT 直接提供插入序列；符号</w:t>
-      </w:r>
-      <w:r>
-        <w:t xml:space="preserve"> </w:t>
+        <w:t xml:space="preserve">VCF 模式只提取具有显式核苷酸序列的插入。非符号 ALT 直接提供插入序列；符号 </w:t>
       </w:r>
       <w:r>
         <w:rPr>
@@ -1409,13 +1166,7 @@
         <w:t xml:space="preserve">&lt;INS&gt;</w:t>
       </w:r>
       <w:r>
-        <w:t xml:space="preserve"> </w:t>
-      </w:r>
-      <w:r>
-        <w:t xml:space="preserve">仅在 INFO 中含</w:t>
-      </w:r>
-      <w:r>
-        <w:t xml:space="preserve"> </w:t>
+        <w:t xml:space="preserve"> 仅在 INFO 中含 </w:t>
       </w:r>
       <w:r>
         <w:rPr>
@@ -1442,13 +1193,7 @@
         <w:t xml:space="preserve">SEQ</w:t>
       </w:r>
       <w:r>
-        <w:t xml:space="preserve"> </w:t>
-      </w:r>
-      <w:r>
-        <w:t xml:space="preserve">或</w:t>
-      </w:r>
-      <w:r>
-        <w:t xml:space="preserve"> </w:t>
+        <w:t xml:space="preserve"> 或 </w:t>
       </w:r>
       <w:r>
         <w:rPr>
@@ -1457,10 +1202,7 @@
         <w:t xml:space="preserve">CONSENSUS</w:t>
       </w:r>
       <w:r>
-        <w:t xml:space="preserve"> </w:t>
-      </w:r>
-      <w:r>
-        <w:t xml:space="preserve">时可提取。没有序列的结构变异只表达事件存在，不能用于从头建立重复共识，因此不加入发现基因组。</w:t>
+        <w:t xml:space="preserve"> 时可提取。没有序列的结构变异只表达事件存在，不能用于从头建立重复共识，因此不加入发现基因组。</w:t>
       </w:r>
     </w:p>
     <w:bookmarkEnd w:id="27"/>
@@ -1478,8 +1220,6 @@
       </w:r>
       <w:r>
         <w:tab/>
-      </w:r>
-      <w:r>
         <w:t xml:space="preserve">3. PAF 泛基因组候选提取算法</w:t>
       </w:r>
     </w:p>
@@ -1496,8 +1236,6 @@
       </w:r>
       <w:r>
         <w:tab/>
-      </w:r>
-      <w:r>
         <w:t xml:space="preserve">3.1 输入验证和记录模型</w:t>
       </w:r>
     </w:p>
@@ -1543,10 +1281,7 @@
         <w:pStyle w:val="FirstParagraph"/>
       </w:pPr>
       <w:r>
-        <w:t xml:space="preserve">解析器要求至少 12 个字段；长度、起止坐标、匹配数、block length 和 MAPQ 必须为合法整数；strand 必须为</w:t>
-      </w:r>
-      <w:r>
-        <w:t xml:space="preserve"> </w:t>
+        <w:t xml:space="preserve">解析器要求至少 12 个字段；长度、起止坐标、匹配数、block length 和 MAPQ 必须为合法整数；strand 必须为 </w:t>
       </w:r>
       <w:r>
         <w:rPr>
@@ -1555,13 +1290,7 @@
         <w:t xml:space="preserve">+</w:t>
       </w:r>
       <w:r>
-        <w:t xml:space="preserve"> </w:t>
-      </w:r>
-      <w:r>
-        <w:t xml:space="preserve">或</w:t>
-      </w:r>
-      <w:r>
-        <w:t xml:space="preserve"> </w:t>
+        <w:t xml:space="preserve"> 或 </w:t>
       </w:r>
       <w:r>
         <w:rPr>
@@ -1570,10 +1299,7 @@
         <w:t xml:space="preserve">-</w:t>
       </w:r>
       <w:r>
-        <w:t xml:space="preserve">；query 和 target 名称必须存在于所给 FASTA 索引且记录长度一致。若提供</w:t>
-      </w:r>
-      <w:r>
-        <w:t xml:space="preserve"> </w:t>
+        <w:t xml:space="preserve">；query 和 target 名称必须存在于所给 FASTA 索引且记录长度一致。若提供 </w:t>
       </w:r>
       <w:r>
         <w:rPr>
@@ -1582,10 +1308,7 @@
         <w:t xml:space="preserve">--paf-mapping</w:t>
       </w:r>
       <w:r>
-        <w:t xml:space="preserve">，同一 assembly 内的旁系比对和不同染色体之间的比对被排除。记录按</w:t>
-      </w:r>
-      <w:r>
-        <w:t xml:space="preserve"> </w:t>
+        <w:t xml:space="preserve">，同一 assembly 内的旁系比对和不同染色体之间的比对被排除。记录按 </w:t>
       </w:r>
       <w:r>
         <w:rPr>
@@ -1594,10 +1317,7 @@
         <w:t xml:space="preserve">(qname,tname)</w:t>
       </w:r>
       <w:r>
-        <w:t xml:space="preserve"> </w:t>
-      </w:r>
-      <w:r>
-        <w:t xml:space="preserve">分组，正负链分别建链。</w:t>
+        <w:t xml:space="preserve"> 分组，正负链分别建链。</w:t>
       </w:r>
     </w:p>
     <w:p>
@@ -1605,10 +1325,7 @@
         <w:pStyle w:val="BodyText"/>
       </w:pPr>
       <w:r>
-        <w:t xml:space="preserve">默认保留条件为比对长度至少 5,000 bp、MAPQ 至少 20。比对器类型根据</w:t>
-      </w:r>
-      <w:r>
-        <w:t xml:space="preserve"> </w:t>
+        <w:t xml:space="preserve">默认保留条件为比对长度至少 5,000 bp、MAPQ 至少 20。比对器类型根据 </w:t>
       </w:r>
       <w:r>
         <w:rPr>
@@ -1617,13 +1334,7 @@
         <w:t xml:space="preserve">tp</w:t>
       </w:r>
       <w:r>
-        <w:t xml:space="preserve"> </w:t>
-      </w:r>
-      <w:r>
-        <w:t xml:space="preserve">或</w:t>
-      </w:r>
-      <w:r>
-        <w:t xml:space="preserve"> </w:t>
+        <w:t xml:space="preserve"> 或 </w:t>
       </w:r>
       <w:r>
         <w:rPr>
@@ -1632,10 +1343,7 @@
         <w:t xml:space="preserve">cg</w:t>
       </w:r>
       <w:r>
-        <w:t xml:space="preserve"> </w:t>
-      </w:r>
-      <w:r>
-        <w:t xml:space="preserve">标签识别为 minimap2，否则按不含 CIGAR 的 fastGA 类记录处理。</w:t>
+        <w:t xml:space="preserve"> 标签识别为 minimap2，否则按不含 CIGAR 的 fastGA 类记录处理。</w:t>
       </w:r>
     </w:p>
     <w:bookmarkEnd w:id="29"/>
@@ -1652,8 +1360,6 @@
       </w:r>
       <w:r>
         <w:tab/>
-      </w:r>
-      <w:r>
         <w:t xml:space="preserve">3.2 链构建</w:t>
       </w:r>
     </w:p>
@@ -1662,10 +1368,7 @@
         <w:pStyle w:val="FirstParagraph"/>
       </w:pPr>
       <w:r>
-        <w:t xml:space="preserve">每个 query-target-strand 组按</w:t>
-      </w:r>
-      <w:r>
-        <w:t xml:space="preserve"> </w:t>
+        <w:t xml:space="preserve">每个 query-target-strand 组按 </w:t>
       </w:r>
       <w:r>
         <w:rPr>
@@ -1674,13 +1377,7 @@
         <w:t xml:space="preserve">tstart</w:t>
       </w:r>
       <w:r>
-        <w:t xml:space="preserve"> </w:t>
-      </w:r>
-      <w:r>
-        <w:t xml:space="preserve">升序排序。贪婪算法从每个未使用记录启动一条链，并扫描后续记录。对相邻记录</w:t>
-      </w:r>
-      <w:r>
-        <w:t xml:space="preserve"> </w:t>
+        <w:t xml:space="preserve"> 升序排序。贪婪算法从每个未使用记录启动一条链，并扫描后续记录。对相邻记录 </w:t>
       </w:r>
       <m:oMath>
         <m:r>
@@ -1737,22 +1434,7 @@
             <m:t>.</m:t>
           </m:r>
           <m:r>
-            <m:t>t</m:t>
-          </m:r>
-          <m:r>
-            <m:t>s</m:t>
-          </m:r>
-          <m:r>
-            <m:t>t</m:t>
-          </m:r>
-          <m:r>
-            <m:t>a</m:t>
-          </m:r>
-          <m:r>
-            <m:t>r</m:t>
-          </m:r>
-          <m:r>
-            <m:t>t</m:t>
+            <m:t>tstart</m:t>
           </m:r>
           <m:r>
             <m:rPr>
@@ -1770,16 +1452,7 @@
             <m:t>.</m:t>
           </m:r>
           <m:r>
-            <m:t>t</m:t>
-          </m:r>
-          <m:r>
-            <m:t>e</m:t>
-          </m:r>
-          <m:r>
-            <m:t>n</m:t>
-          </m:r>
-          <m:r>
-            <m:t>d</m:t>
+            <m:t>tend</m:t>
           </m:r>
         </m:oMath>
       </m:oMathPara>
@@ -1829,22 +1502,7 @@
             <m:t>.</m:t>
           </m:r>
           <m:r>
-            <m:t>q</m:t>
-          </m:r>
-          <m:r>
-            <m:t>s</m:t>
-          </m:r>
-          <m:r>
-            <m:t>t</m:t>
-          </m:r>
-          <m:r>
-            <m:t>a</m:t>
-          </m:r>
-          <m:r>
-            <m:t>r</m:t>
-          </m:r>
-          <m:r>
-            <m:t>t</m:t>
+            <m:t>qstart</m:t>
           </m:r>
           <m:r>
             <m:rPr>
@@ -1862,16 +1520,7 @@
             <m:t>.</m:t>
           </m:r>
           <m:r>
-            <m:t>q</m:t>
-          </m:r>
-          <m:r>
-            <m:t>e</m:t>
-          </m:r>
-          <m:r>
-            <m:t>n</m:t>
-          </m:r>
-          <m:r>
-            <m:t>d</m:t>
+            <m:t>qend</m:t>
           </m:r>
         </m:oMath>
       </m:oMathPara>
@@ -1921,22 +1570,7 @@
             <m:t>.</m:t>
           </m:r>
           <m:r>
-            <m:t>q</m:t>
-          </m:r>
-          <m:r>
-            <m:t>s</m:t>
-          </m:r>
-          <m:r>
-            <m:t>t</m:t>
-          </m:r>
-          <m:r>
-            <m:t>a</m:t>
-          </m:r>
-          <m:r>
-            <m:t>r</m:t>
-          </m:r>
-          <m:r>
-            <m:t>t</m:t>
+            <m:t>qstart</m:t>
           </m:r>
           <m:r>
             <m:rPr>
@@ -1954,16 +1588,7 @@
             <m:t>.</m:t>
           </m:r>
           <m:r>
-            <m:t>q</m:t>
-          </m:r>
-          <m:r>
-            <m:t>e</m:t>
-          </m:r>
-          <m:r>
-            <m:t>n</m:t>
-          </m:r>
-          <m:r>
-            <m:t>d</m:t>
+            <m:t>qend</m:t>
           </m:r>
         </m:oMath>
       </m:oMathPara>
@@ -1973,10 +1598,7 @@
         <w:pStyle w:val="FirstParagraph"/>
       </w:pPr>
       <w:r>
-        <w:t xml:space="preserve">只有</w:t>
-      </w:r>
-      <w:r>
-        <w:t xml:space="preserve"> </w:t>
+        <w:t xml:space="preserve">只有 </w:t>
       </w:r>
       <m:oMath>
         <m:sSub>
@@ -1993,13 +1615,7 @@
         </m:sSub>
       </m:oMath>
       <w:r>
-        <w:t xml:space="preserve"> </w:t>
-      </w:r>
-      <w:r>
-        <w:t xml:space="preserve">和</w:t>
-      </w:r>
-      <w:r>
-        <w:t xml:space="preserve"> </w:t>
+        <w:t xml:space="preserve"> 和 </w:t>
       </w:r>
       <m:oMath>
         <m:sSub>
@@ -2016,13 +1632,7 @@
         </m:sSub>
       </m:oMath>
       <w:r>
-        <w:t xml:space="preserve"> </w:t>
-      </w:r>
-      <w:r>
-        <w:t xml:space="preserve">均不小于</w:t>
-      </w:r>
-      <w:r>
-        <w:t xml:space="preserve"> </w:t>
+        <w:t xml:space="preserve"> 均不小于 </w:t>
       </w:r>
       <w:r>
         <w:rPr>
@@ -2031,13 +1641,7 @@
         <w:t xml:space="preserve">-overlap_tolerance</w:t>
       </w:r>
       <w:r>
-        <w:t xml:space="preserve"> </w:t>
-      </w:r>
-      <w:r>
-        <w:t xml:space="preserve">且不大于</w:t>
-      </w:r>
-      <w:r>
-        <w:t xml:space="preserve"> </w:t>
+        <w:t xml:space="preserve"> 且不大于 </w:t>
       </w:r>
       <w:r>
         <w:rPr>
@@ -2046,10 +1650,7 @@
         <w:t xml:space="preserve">max_chain_gap</w:t>
       </w:r>
       <w:r>
-        <w:t xml:space="preserve"> </w:t>
-      </w:r>
-      <w:r>
-        <w:t xml:space="preserve">时，</w:t>
+        <w:t xml:space="preserve"> 时，</w:t>
       </w:r>
       <m:oMath>
         <m:r>
@@ -2057,13 +1658,7 @@
         </m:r>
       </m:oMath>
       <w:r>
-        <w:t xml:space="preserve"> </w:t>
-      </w:r>
-      <w:r>
-        <w:t xml:space="preserve">才加入该链。默认 overlap tolerance 为 200 bp，最大链间距为 500 kb。由于记录按 target 排序，一旦</w:t>
-      </w:r>
-      <w:r>
-        <w:t xml:space="preserve"> </w:t>
+        <w:t xml:space="preserve"> 才加入该链。默认 overlap tolerance 为 200 bp，最大链间距为 500 kb。由于记录按 target 排序，一旦 </w:t>
       </w:r>
       <m:oMath>
         <m:sSub>
@@ -2089,13 +1684,7 @@
         </m:r>
       </m:oMath>
       <w:r>
-        <w:t xml:space="preserve"> </w:t>
-      </w:r>
-      <w:r>
-        <w:t xml:space="preserve">kb 即终止该内层扫描。保留链至少含 3 条 alignment，且 target aligned length 总和至少为</w:t>
-      </w:r>
-      <w:r>
-        <w:t xml:space="preserve"> </w:t>
+        <w:t xml:space="preserve"> kb 即终止该内层扫描。保留链至少含 3 条 alignment，且 target aligned length 总和至少为 </w:t>
       </w:r>
       <m:oMath>
         <m:r>
@@ -2119,7 +1708,7 @@
               <m:rPr>
                 <m:nor/>
               </m:rPr>
-              <m:t> kb</m:t>
+              <m:t xml:space="preserve"> kb</m:t>
             </m:r>
             <m:r>
               <m:rPr>
@@ -2138,13 +1727,7 @@
               </m:e>
               <m:sub>
                 <m:r>
-                  <m:t>m</m:t>
-                </m:r>
-                <m:r>
-                  <m:t>a</m:t>
-                </m:r>
-                <m:r>
-                  <m:t>x</m:t>
+                  <m:t>max</m:t>
                 </m:r>
               </m:sub>
             </m:sSub>
@@ -2152,10 +1735,7 @@
         </m:d>
       </m:oMath>
       <w:r>
-        <w:t xml:space="preserve">；默认候选最大长度</w:t>
-      </w:r>
-      <w:r>
-        <w:t xml:space="preserve"> </w:t>
+        <w:t xml:space="preserve">；默认候选最大长度 </w:t>
       </w:r>
       <m:oMath>
         <m:sSub>
@@ -2166,13 +1746,7 @@
           </m:e>
           <m:sub>
             <m:r>
-              <m:t>m</m:t>
-            </m:r>
-            <m:r>
-              <m:t>a</m:t>
-            </m:r>
-            <m:r>
-              <m:t>x</m:t>
+              <m:t>max</m:t>
             </m:r>
           </m:sub>
         </m:sSub>
@@ -2187,10 +1761,7 @@
         </m:r>
       </m:oMath>
       <w:r>
-        <w:t xml:space="preserve"> </w:t>
-      </w:r>
-      <w:r>
-        <w:t xml:space="preserve">kb，因此默认总锚定长度门槛为 60 kb。</w:t>
+        <w:t xml:space="preserve"> kb，因此默认总锚定长度门槛为 60 kb。</w:t>
       </w:r>
     </w:p>
     <w:p>
@@ -2198,10 +1769,7 @@
         <w:pStyle w:val="BodyText"/>
       </w:pPr>
       <w:r>
-        <w:t xml:space="preserve">该贪婪算法最坏复杂度为</w:t>
-      </w:r>
-      <w:r>
-        <w:t xml:space="preserve"> </w:t>
+        <w:t xml:space="preserve">该贪婪算法最坏复杂度为 </w:t>
       </w:r>
       <m:oMath>
         <m:r>
@@ -2248,8 +1816,6 @@
       </w:r>
       <w:r>
         <w:tab/>
-      </w:r>
-      <w:r>
         <w:t xml:space="preserve">3.3 链间不对称缺口</w:t>
       </w:r>
     </w:p>
@@ -2258,10 +1824,7 @@
         <w:pStyle w:val="FirstParagraph"/>
       </w:pPr>
       <w:r>
-        <w:t xml:space="preserve">对链内相邻 alignment 计算</w:t>
-      </w:r>
-      <w:r>
-        <w:t xml:space="preserve"> </w:t>
+        <w:t xml:space="preserve">对链内相邻 alignment 计算 </w:t>
       </w:r>
       <m:oMath>
         <m:sSub>
@@ -2278,13 +1841,7 @@
         </m:sSub>
       </m:oMath>
       <w:r>
-        <w:t xml:space="preserve"> </w:t>
-      </w:r>
-      <w:r>
-        <w:t xml:space="preserve">和</w:t>
-      </w:r>
-      <w:r>
-        <w:t xml:space="preserve"> </w:t>
+        <w:t xml:space="preserve"> 和 </w:t>
       </w:r>
       <m:oMath>
         <m:sSub>
@@ -2321,13 +1878,7 @@
             </m:e>
             <m:sub>
               <m:r>
-                <m:t>m</m:t>
-              </m:r>
-              <m:r>
-                <m:t>a</m:t>
-              </m:r>
-              <m:r>
-                <m:t>x</m:t>
+                <m:t>max</m:t>
               </m:r>
             </m:sub>
           </m:sSub>
@@ -2335,13 +1886,7 @@
             <m:rPr>
               <m:sty m:val="p"/>
             </m:rPr>
-            <m:t>=</m:t>
-          </m:r>
-          <m:r>
-            <m:rPr>
-              <m:sty m:val="p"/>
-            </m:rPr>
-            <m:t>max</m:t>
+            <m:t>=max</m:t>
           </m:r>
           <m:d>
             <m:dPr>
@@ -2420,13 +1965,7 @@
             </m:e>
             <m:sub>
               <m:r>
-                <m:t>m</m:t>
-              </m:r>
-              <m:r>
-                <m:t>i</m:t>
-              </m:r>
-              <m:r>
-                <m:t>n</m:t>
+                <m:t>min</m:t>
               </m:r>
             </m:sub>
           </m:sSub>
@@ -2434,13 +1973,7 @@
             <m:rPr>
               <m:sty m:val="p"/>
             </m:rPr>
-            <m:t>=</m:t>
-          </m:r>
-          <m:r>
-            <m:rPr>
-              <m:sty m:val="p"/>
-            </m:rPr>
-            <m:t>min</m:t>
+            <m:t>=min</m:t>
           </m:r>
           <m:d>
             <m:dPr>
@@ -2509,10 +2042,7 @@
             <m:t>,</m:t>
           </m:r>
           <m:r>
-            <m:t> </m:t>
-          </m:r>
-          <m:r>
-            <m:t>r</m:t>
+            <m:t> r</m:t>
           </m:r>
           <m:r>
             <m:rPr>
@@ -2528,13 +2058,7 @@
             </m:e>
             <m:sub>
               <m:r>
-                <m:t>m</m:t>
-              </m:r>
-              <m:r>
-                <m:t>i</m:t>
-              </m:r>
-              <m:r>
-                <m:t>n</m:t>
+                <m:t>min</m:t>
               </m:r>
             </m:sub>
           </m:sSub>
@@ -2552,13 +2076,7 @@
             </m:e>
             <m:sub>
               <m:r>
-                <m:t>m</m:t>
-              </m:r>
-              <m:r>
-                <m:t>a</m:t>
-              </m:r>
-              <m:r>
-                <m:t>x</m:t>
+                <m:t>max</m:t>
               </m:r>
             </m:sub>
           </m:sSub>
@@ -2570,10 +2088,7 @@
         <w:pStyle w:val="FirstParagraph"/>
       </w:pPr>
       <w:r>
-        <w:t xml:space="preserve">候选满足</w:t>
-      </w:r>
-      <w:r>
-        <w:t xml:space="preserve"> </w:t>
+        <w:t xml:space="preserve">候选满足 </w:t>
       </w:r>
       <m:oMath>
         <m:r>
@@ -2593,13 +2108,7 @@
           </m:e>
           <m:sub>
             <m:r>
-              <m:t>m</m:t>
-            </m:r>
-            <m:r>
-              <m:t>a</m:t>
-            </m:r>
-            <m:r>
-              <m:t>x</m:t>
+              <m:t>max</m:t>
             </m:r>
           </m:sub>
         </m:sSub>
@@ -2623,13 +2132,7 @@
         </m:r>
       </m:oMath>
       <w:r>
-        <w:t xml:space="preserve"> </w:t>
-      </w:r>
-      <w:r>
-        <w:t xml:space="preserve">bp 且</w:t>
-      </w:r>
-      <w:r>
-        <w:t xml:space="preserve"> </w:t>
+        <w:t xml:space="preserve"> bp 且 </w:t>
       </w:r>
       <m:oMath>
         <m:r>
@@ -2646,10 +2149,7 @@
         </m:r>
       </m:oMath>
       <w:r>
-        <w:t xml:space="preserve">。若</w:t>
-      </w:r>
-      <w:r>
-        <w:t xml:space="preserve"> </w:t>
+        <w:t xml:space="preserve">。若 </w:t>
       </w:r>
       <m:oMath>
         <m:d>
@@ -2704,10 +2204,7 @@
         </m:d>
       </m:oMath>
       <w:r>
-        <w:t xml:space="preserve">，插入位于 query；若</w:t>
-      </w:r>
-      <w:r>
-        <w:t xml:space="preserve"> </w:t>
+        <w:t xml:space="preserve">，插入位于 query；若 </w:t>
       </w:r>
       <m:oMath>
         <m:d>
@@ -2787,8 +2284,6 @@
       </w:r>
       <w:r>
         <w:tab/>
-      </w:r>
-      <w:r>
         <w:t xml:space="preserve">3.4 CIGAR 内部插入</w:t>
       </w:r>
     </w:p>
@@ -2797,10 +2292,7 @@
         <w:pStyle w:val="FirstParagraph"/>
       </w:pPr>
       <w:r>
-        <w:t xml:space="preserve">minimap2</w:t>
-      </w:r>
-      <w:r>
-        <w:t xml:space="preserve"> </w:t>
+        <w:t xml:space="preserve">minimap2 </w:t>
       </w:r>
       <w:r>
         <w:rPr>
@@ -2809,10 +2301,7 @@
         <w:t xml:space="preserve">cg:Z</w:t>
       </w:r>
       <w:r>
-        <w:t xml:space="preserve"> </w:t>
-      </w:r>
-      <w:r>
-        <w:t xml:space="preserve">被完整重构，操作含义如下：</w:t>
+        <w:t xml:space="preserve"> 被完整重构，操作含义如下：</w:t>
       </w:r>
       <w:r>
         <w:rPr>
@@ -2821,10 +2310,7 @@
         <w:t xml:space="preserve">M/=/X</w:t>
       </w:r>
       <w:r>
-        <w:t xml:space="preserve"> </w:t>
-      </w:r>
-      <w:r>
-        <w:t xml:space="preserve">同时推进 query 和 target；</w:t>
+        <w:t xml:space="preserve"> 同时推进 query 和 target；</w:t>
       </w:r>
       <w:r>
         <w:rPr>
@@ -2833,10 +2319,7 @@
         <w:t xml:space="preserve">I</w:t>
       </w:r>
       <w:r>
-        <w:t xml:space="preserve"> </w:t>
-      </w:r>
-      <w:r>
-        <w:t xml:space="preserve">只推进 query 并产生 query-side insertion；</w:t>
+        <w:t xml:space="preserve"> 只推进 query 并产生 query-side insertion；</w:t>
       </w:r>
       <w:r>
         <w:rPr>
@@ -2845,10 +2328,7 @@
         <w:t xml:space="preserve">D</w:t>
       </w:r>
       <w:r>
-        <w:t xml:space="preserve"> </w:t>
-      </w:r>
-      <w:r>
-        <w:t xml:space="preserve">只推进 target 并产生 target-side insertion；</w:t>
+        <w:t xml:space="preserve"> 只推进 target 并产生 target-side insertion；</w:t>
       </w:r>
       <w:r>
         <w:rPr>
@@ -2857,10 +2337,7 @@
         <w:t xml:space="preserve">N</w:t>
       </w:r>
       <w:r>
-        <w:t xml:space="preserve"> </w:t>
-      </w:r>
-      <w:r>
-        <w:t xml:space="preserve">只推进 target；</w:t>
+        <w:t xml:space="preserve"> 只推进 target；</w:t>
       </w:r>
       <w:r>
         <w:rPr>
@@ -2869,10 +2346,7 @@
         <w:t xml:space="preserve">S/H</w:t>
       </w:r>
       <w:r>
-        <w:t xml:space="preserve"> </w:t>
-      </w:r>
-      <w:r>
-        <w:t xml:space="preserve">使该记录不进入 CIGAR 候选提取；</w:t>
+        <w:t xml:space="preserve"> 使该记录不进入 CIGAR 候选提取；</w:t>
       </w:r>
       <w:r>
         <w:rPr>
@@ -2881,13 +2355,7 @@
         <w:t xml:space="preserve">P</w:t>
       </w:r>
       <w:r>
-        <w:t xml:space="preserve"> </w:t>
-      </w:r>
-      <w:r>
-        <w:t xml:space="preserve">不推进坐标。负链 query cursor 从</w:t>
-      </w:r>
-      <w:r>
-        <w:t xml:space="preserve"> </w:t>
+        <w:t xml:space="preserve"> 不推进坐标。负链 query cursor 从 </w:t>
       </w:r>
       <w:r>
         <w:rPr>
@@ -2896,13 +2364,7 @@
         <w:t xml:space="preserve">qend</w:t>
       </w:r>
       <w:r>
-        <w:t xml:space="preserve"> </w:t>
-      </w:r>
-      <w:r>
-        <w:t xml:space="preserve">向</w:t>
-      </w:r>
-      <w:r>
-        <w:t xml:space="preserve"> </w:t>
+        <w:t xml:space="preserve"> 向 </w:t>
       </w:r>
       <w:r>
         <w:rPr>
@@ -2911,10 +2373,7 @@
         <w:t xml:space="preserve">qstart</w:t>
       </w:r>
       <w:r>
-        <w:t xml:space="preserve"> </w:t>
-      </w:r>
-      <w:r>
-        <w:t xml:space="preserve">递减。</w:t>
+        <w:t xml:space="preserve"> 递减。</w:t>
       </w:r>
     </w:p>
     <w:p>
@@ -2922,10 +2381,7 @@
         <w:pStyle w:val="BodyText"/>
       </w:pPr>
       <w:r>
-        <w:t xml:space="preserve">解析后重新计算 query 和 target 消耗长度，并分别与 PAF 的</w:t>
-      </w:r>
-      <w:r>
-        <w:t xml:space="preserve"> </w:t>
+        <w:t xml:space="preserve">解析后重新计算 query 和 target 消耗长度，并分别与 PAF 的 </w:t>
       </w:r>
       <w:r>
         <w:rPr>
@@ -2943,10 +2399,7 @@
         <w:t xml:space="preserve">tend-tstart</w:t>
       </w:r>
       <w:r>
-        <w:t xml:space="preserve"> </w:t>
-      </w:r>
-      <w:r>
-        <w:t xml:space="preserve">比较。CIGAR 字符串不完整、存在未知操作或坐标消耗不一致时，整条记录的 CIGAR 候选被拒绝，避免一个错误操作使后续插入坐标整体偏移。</w:t>
+        <w:t xml:space="preserve"> 比较。CIGAR 字符串不完整、存在未知操作或坐标消耗不一致时，整条记录的 CIGAR 候选被拒绝，避免一个错误操作使后续插入坐标整体偏移。</w:t>
       </w:r>
     </w:p>
     <w:bookmarkEnd w:id="32"/>
@@ -2963,8 +2416,6 @@
       </w:r>
       <w:r>
         <w:tab/>
-      </w:r>
-      <w:r>
         <w:t xml:space="preserve">3.5 候选合并、序列提取与 QC</w:t>
       </w:r>
     </w:p>
@@ -2973,10 +2424,7 @@
         <w:pStyle w:val="FirstParagraph"/>
       </w:pPr>
       <w:r>
-        <w:t xml:space="preserve">来自链间缺口和 CIGAR 的候选统一转为</w:t>
-      </w:r>
-      <w:r>
-        <w:t xml:space="preserve"> </w:t>
+        <w:t xml:space="preserve">来自链间缺口和 CIGAR 的候选统一转为 </w:t>
       </w:r>
       <w:r>
         <w:rPr>
@@ -2993,10 +2441,7 @@
         <w:pStyle w:val="BodyText"/>
       </w:pPr>
       <w:r>
-        <w:t xml:space="preserve">序列通过</w:t>
-      </w:r>
-      <w:r>
-        <w:t xml:space="preserve"> </w:t>
+        <w:t xml:space="preserve">序列通过 </w:t>
       </w:r>
       <w:r>
         <w:rPr>
@@ -3005,10 +2450,7 @@
         <w:t xml:space="preserve">samtools faidx</w:t>
       </w:r>
       <w:r>
-        <w:t xml:space="preserve"> </w:t>
-      </w:r>
-      <w:r>
-        <w:t xml:space="preserve">批量提取；负链候选取反向互补。默认序列 QC 包括 100–30,000 bp 长度、N 比例、单核苷酸熵、二核苷酸熵、低复杂度窗口比例和 DUST。通过 QC 的候选使用 CD-HIT-EST 去冗余，并以独立 FASTA record 追加到分析基因组；</w:t>
+        <w:t xml:space="preserve"> 批量提取；负链候选取反向互补。默认序列 QC 包括 100–30,000 bp 长度、N 比例、单核苷酸熵、二核苷酸熵、低复杂度窗口比例和 DUST。通过 QC 的候选使用 CD-HIT-EST 去冗余，并以独立 FASTA record 追加到分析基因组；</w:t>
       </w:r>
       <w:r>
         <w:rPr>
@@ -3017,10 +2459,7 @@
         <w:t xml:space="preserve">--gfa-spacer-length</w:t>
       </w:r>
       <w:r>
-        <w:t xml:space="preserve"> </w:t>
-      </w:r>
-      <w:r>
-        <w:t xml:space="preserve">仅在下游需要单 scaffold 时引入人工 N 间隔。</w:t>
+        <w:t xml:space="preserve"> 仅在下游需要单 scaffold 时引入人工 N 间隔。</w:t>
       </w:r>
     </w:p>
     <w:bookmarkEnd w:id="33"/>
@@ -3038,8 +2477,6 @@
       </w:r>
       <w:r>
         <w:tab/>
-      </w:r>
-      <w:r>
         <w:t xml:space="preserve">4. GFA 到发现序列的转换</w:t>
       </w:r>
     </w:p>
@@ -3056,8 +2493,6 @@
       </w:r>
       <w:r>
         <w:tab/>
-      </w:r>
-      <w:r>
         <w:t xml:space="preserve">4.1 图格式判别</w:t>
       </w:r>
     </w:p>
@@ -3066,10 +2501,7 @@
         <w:pStyle w:val="FirstParagraph"/>
       </w:pPr>
       <w:r>
-        <w:t xml:space="preserve">图解析器检查 S 记录的</w:t>
-      </w:r>
-      <w:r>
-        <w:t xml:space="preserve"> </w:t>
+        <w:t xml:space="preserve">图解析器检查 S 记录的 </w:t>
       </w:r>
       <w:r>
         <w:rPr>
@@ -3078,13 +2510,7 @@
         <w:t xml:space="preserve">SR:i</w:t>
       </w:r>
       <w:r>
-        <w:t xml:space="preserve"> </w:t>
-      </w:r>
-      <w:r>
-        <w:t xml:space="preserve">标签。具有 rGFA rank 语义的图按 minigraph rGFA 处理；具有内嵌 P/W sample paths 的图按 PGGB/smoothxg 处理。S 记录必须提供序列或正的</w:t>
-      </w:r>
-      <w:r>
-        <w:t xml:space="preserve"> </w:t>
+        <w:t xml:space="preserve"> 标签。具有 rGFA rank 语义的图按 minigraph rGFA 处理；具有内嵌 P/W sample paths 的图按 PGGB/smoothxg 处理。S 记录必须提供序列或正的 </w:t>
       </w:r>
       <w:r>
         <w:rPr>
@@ -3110,8 +2536,6 @@
       </w:r>
       <w:r>
         <w:tab/>
-      </w:r>
-      <w:r>
         <w:t xml:space="preserve">4.2 PGGB/smoothxg 参考路径和等位区间</w:t>
       </w:r>
     </w:p>
@@ -3120,10 +2544,7 @@
         <w:pStyle w:val="FirstParagraph"/>
       </w:pPr>
       <w:r>
-        <w:t xml:space="preserve">P 路径的节点步表示为</w:t>
-      </w:r>
-      <w:r>
-        <w:t xml:space="preserve"> </w:t>
+        <w:t xml:space="preserve">P 路径的节点步表示为 </w:t>
       </w:r>
       <w:r>
         <w:rPr>
@@ -3132,13 +2553,7 @@
         <w:t xml:space="preserve">node+</w:t>
       </w:r>
       <w:r>
-        <w:t xml:space="preserve"> </w:t>
-      </w:r>
-      <w:r>
-        <w:t xml:space="preserve">或</w:t>
-      </w:r>
-      <w:r>
-        <w:t xml:space="preserve"> </w:t>
+        <w:t xml:space="preserve"> 或 </w:t>
       </w:r>
       <w:r>
         <w:rPr>
@@ -3147,10 +2562,7 @@
         <w:t xml:space="preserve">node-</w:t>
       </w:r>
       <w:r>
-        <w:t xml:space="preserve">，W walk 使用</w:t>
-      </w:r>
-      <w:r>
-        <w:t xml:space="preserve"> </w:t>
+        <w:t xml:space="preserve">，W walk 使用 </w:t>
       </w:r>
       <w:r>
         <w:rPr>
@@ -3159,13 +2571,7 @@
         <w:t xml:space="preserve">&gt;node</w:t>
       </w:r>
       <w:r>
-        <w:t xml:space="preserve"> </w:t>
-      </w:r>
-      <w:r>
-        <w:t xml:space="preserve">或</w:t>
-      </w:r>
-      <w:r>
-        <w:t xml:space="preserve"> </w:t>
+        <w:t xml:space="preserve"> 或 </w:t>
       </w:r>
       <w:r>
         <w:rPr>
@@ -3174,10 +2580,7 @@
         <w:t xml:space="preserve">&lt;node</w:t>
       </w:r>
       <w:r>
-        <w:t xml:space="preserve">。节点序列按方向拼接。相邻节点 overlap 来自 P overlap 字段或 bidirected L link；只有完全由</w:t>
-      </w:r>
-      <w:r>
-        <w:t xml:space="preserve"> </w:t>
+        <w:t xml:space="preserve">。节点序列按方向拼接。相邻节点 overlap 来自 P overlap 字段或 bidirected L link；只有完全由 </w:t>
       </w:r>
       <w:r>
         <w:rPr>
@@ -3186,10 +2589,7 @@
         <w:t xml:space="preserve">M/=/X</w:t>
       </w:r>
       <w:r>
-        <w:t xml:space="preserve"> </w:t>
-      </w:r>
-      <w:r>
-        <w:t xml:space="preserve">组成的 overlap CIGAR可转换为确定的 overlap 长度。路径坐标前缀为：</w:t>
+        <w:t xml:space="preserve"> 组成的 overlap CIGAR可转换为确定的 overlap 长度。路径坐标前缀为：</w:t>
       </w:r>
     </w:p>
     <w:p>
@@ -3324,10 +2724,7 @@
         <w:pStyle w:val="FirstParagraph"/>
       </w:pPr>
       <w:r>
-        <w:t xml:space="preserve">其中</w:t>
-      </w:r>
-      <w:r>
-        <w:t xml:space="preserve"> </w:t>
+        <w:t xml:space="preserve">其中 </w:t>
       </w:r>
       <m:oMath>
         <m:sSub>
@@ -3344,13 +2741,7 @@
         </m:sSub>
       </m:oMath>
       <w:r>
-        <w:t xml:space="preserve"> </w:t>
-      </w:r>
-      <w:r>
-        <w:t xml:space="preserve">是节点</w:t>
-      </w:r>
-      <w:r>
-        <w:t xml:space="preserve"> </w:t>
+        <w:t xml:space="preserve"> 是节点 </w:t>
       </w:r>
       <m:oMath>
         <m:r>
@@ -3358,13 +2749,7 @@
         </m:r>
       </m:oMath>
       <w:r>
-        <w:t xml:space="preserve"> </w:t>
-      </w:r>
-      <w:r>
-        <w:t xml:space="preserve">与</w:t>
-      </w:r>
-      <w:r>
-        <w:t xml:space="preserve"> </w:t>
+        <w:t xml:space="preserve"> 与 </w:t>
       </w:r>
       <m:oMath>
         <m:r>
@@ -3381,13 +2766,7 @@
         </m:r>
       </m:oMath>
       <w:r>
-        <w:t xml:space="preserve"> </w:t>
-      </w:r>
-      <w:r>
-        <w:t xml:space="preserve">的 overlap。bidirected 边同时检查正向键</w:t>
-      </w:r>
-      <w:r>
-        <w:t xml:space="preserve"> </w:t>
+        <w:t xml:space="preserve"> 的 overlap。bidirected 边同时检查正向键 </w:t>
       </w:r>
       <w:r>
         <w:rPr>
@@ -3396,13 +2775,7 @@
         <w:t xml:space="preserve">(A,o_A,B,o_B)</w:t>
       </w:r>
       <w:r>
-        <w:t xml:space="preserve"> </w:t>
-      </w:r>
-      <w:r>
-        <w:t xml:space="preserve">与反向互补键</w:t>
-      </w:r>
-      <w:r>
-        <w:t xml:space="preserve"> </w:t>
+        <w:t xml:space="preserve"> 与反向互补键 </w:t>
       </w:r>
       <w:r>
         <w:rPr>
@@ -3419,10 +2792,7 @@
         <w:pStyle w:val="BodyText"/>
       </w:pPr>
       <w:r>
-        <w:t xml:space="preserve">参考样本由</w:t>
-      </w:r>
-      <w:r>
-        <w:t xml:space="preserve"> </w:t>
+        <w:t xml:space="preserve">参考样本由 </w:t>
       </w:r>
       <w:r>
         <w:rPr>
@@ -3431,10 +2801,7 @@
         <w:t xml:space="preserve">--gfa-ref</w:t>
       </w:r>
       <w:r>
-        <w:t xml:space="preserve"> </w:t>
-      </w:r>
-      <w:r>
-        <w:t xml:space="preserve">或路径支持自动确定。参考路径的节点顺序构成 anchor rank。对每条非参考路径，提取方向一致、rank 单调递增的参考节点作为锚点，并取最大共线锚链。相邻锚点之间的非参考 node walk 构成 alternate allele；同一区间的 reference internal nodes 构成 reference allele。两者序列不同且 alternate 长度在 100–30,000 bp 范围时生成候选。</w:t>
+        <w:t xml:space="preserve"> 或路径支持自动确定。参考路径的节点顺序构成 anchor rank。对每条非参考路径，提取方向一致、rank 单调递增的参考节点作为锚点，并取最大共线锚链。相邻锚点之间的非参考 node walk 构成 alternate allele；同一区间的 reference internal nodes 构成 reference allele。两者序列不同且 alternate 长度在 100–30,000 bp 范围时生成候选。</w:t>
       </w:r>
     </w:p>
     <w:p>
@@ -3467,8 +2834,6 @@
       </w:r>
       <w:r>
         <w:tab/>
-      </w:r>
-      <w:r>
         <w:t xml:space="preserve">4.3 minigraph rGFA 与 GAF 等位提取</w:t>
       </w:r>
     </w:p>
@@ -3477,10 +2842,7 @@
         <w:pStyle w:val="FirstParagraph"/>
       </w:pPr>
       <w:r>
-        <w:t xml:space="preserve">严格 rGFA 后端要求每个 S 记录含内嵌序列以及</w:t>
-      </w:r>
-      <w:r>
-        <w:t xml:space="preserve"> </w:t>
+        <w:t xml:space="preserve">严格 rGFA 后端要求每个 S 记录含内嵌序列以及 </w:t>
       </w:r>
       <w:r>
         <w:rPr>
@@ -3489,10 +2851,7 @@
         <w:t xml:space="preserve">SR/SN/SO</w:t>
       </w:r>
       <w:r>
-        <w:t xml:space="preserve">，L overlap 为</w:t>
-      </w:r>
-      <w:r>
-        <w:t xml:space="preserve"> </w:t>
+        <w:t xml:space="preserve">，L overlap 为 </w:t>
       </w:r>
       <w:r>
         <w:rPr>
@@ -3510,10 +2869,7 @@
         <w:t xml:space="preserve">(SN,start,end)</w:t>
       </w:r>
       <w:r>
-        <w:t xml:space="preserve"> </w:t>
-      </w:r>
-      <w:r>
-        <w:t xml:space="preserve">到 node；每个 source path 的有序区间；SR=0 reference contig 的 node rank 和 prefix length。SR=0 节点必须在各 contig 上无重叠且坐标连续。</w:t>
+        <w:t xml:space="preserve"> 到 node；每个 source path 的有序区间；SR=0 reference contig 的 node rank 和 prefix length。SR=0 节点必须在各 contig 上无重叠且坐标连续。</w:t>
       </w:r>
     </w:p>
     <w:p>
@@ -3530,10 +2886,7 @@
         <w:t xml:space="preserve">cg</w:t>
       </w:r>
       <w:r>
-        <w:t xml:space="preserve"> </w:t>
-      </w:r>
-      <w:r>
-        <w:t xml:space="preserve">消耗、resolved path length 和每条相邻图边。path 支持三种表示：直接 node walk、</w:t>
+        <w:t xml:space="preserve"> 消耗、resolved path length 和每条相邻图边。path 支持三种表示：直接 node walk、</w:t>
       </w:r>
       <w:r>
         <w:rPr>
@@ -3542,10 +2895,7 @@
         <w:t xml:space="preserve">source:start-end</w:t>
       </w:r>
       <w:r>
-        <w:t xml:space="preserve"> </w:t>
-      </w:r>
-      <w:r>
-        <w:t xml:space="preserve">坐标 token walk、命名 source path。坐标 token 只有在精确命中一个节点或能展开为完整连续节点序列时才被接受。</w:t>
+        <w:t xml:space="preserve"> 坐标 token walk、命名 source path。坐标 token 只有在精确命中一个节点或能展开为完整连续节点序列时才被接受。</w:t>
       </w:r>
     </w:p>
     <w:p>
@@ -3553,10 +2903,7 @@
         <w:pStyle w:val="BodyText"/>
       </w:pPr>
       <w:r>
-        <w:t xml:space="preserve">对每条高质量记录，只使用被</w:t>
-      </w:r>
-      <w:r>
-        <w:t xml:space="preserve"> </w:t>
+        <w:t xml:space="preserve">对每条高质量记录，只使用被 </w:t>
       </w:r>
       <w:r>
         <w:rPr>
@@ -3565,10 +2912,7 @@
         <w:t xml:space="preserve">path_start/path_end</w:t>
       </w:r>
       <w:r>
-        <w:t xml:space="preserve"> </w:t>
-      </w:r>
-      <w:r>
-        <w:t xml:space="preserve">完整覆盖的节点作等位序列锚定，部分终端节点不用于构造完整 allele。负链 traversal 反转节点顺序并翻转节点方向，标准化到 query-forward。</w:t>
+        <w:t xml:space="preserve"> 完整覆盖的节点作等位序列锚定，部分终端节点不用于构造完整 allele。负链 traversal 反转节点顺序并翻转节点方向，标准化到 query-forward。</w:t>
       </w:r>
     </w:p>
     <w:p>
@@ -3576,10 +2920,7 @@
         <w:pStyle w:val="BodyText"/>
       </w:pPr>
       <w:r>
-        <w:t xml:space="preserve">SR=0 节点按 reference rank 构建最大递增锚链。每对相邻参考锚点之间拼接 alternate complete nodes，并与 reference internal sequence 比较。变化且长度满足候选范围时写入 locus-aware allele。presence 矩阵第二次扫描 GAF：只有同一条高质量记录完整跨越一个 locus 的两个外侧锚点时，样本才得到 0 或 1；没有完整 spanning record 时为</w:t>
-      </w:r>
-      <w:r>
-        <w:t xml:space="preserve"> </w:t>
+        <w:t xml:space="preserve">SR=0 节点按 reference rank 构建最大递增锚链。每对相邻参考锚点之间拼接 alternate complete nodes，并与 reference internal sequence 比较。变化且长度满足候选范围时写入 locus-aware allele。presence 矩阵第二次扫描 GAF：只有同一条高质量记录完整跨越一个 locus 的两个外侧锚点时，样本才得到 0 或 1；没有完整 spanning record 时为 </w:t>
       </w:r>
       <w:r>
         <w:rPr>
@@ -3605,8 +2946,6 @@
       </w:r>
       <w:r>
         <w:tab/>
-      </w:r>
-      <w:r>
         <w:t xml:space="preserve">4.4 legacy 拓扑 walker 的解释范围</w:t>
       </w:r>
     </w:p>
@@ -3621,10 +2960,7 @@
         <w:t xml:space="preserve">--gfa-mode legacy</w:t>
       </w:r>
       <w:r>
-        <w:t xml:space="preserve"> </w:t>
-      </w:r>
-      <w:r>
-        <w:t xml:space="preserve">从参考节点出发遍历非参考分支并寻找回接点，可用于没有 GAF 的 rGFA 候选提取。该模式不具有可靠的样本路径、位点频率和等位关系语义，因此输出只表示拓扑候选，不用于样本 presence/absence 推断。</w:t>
+        <w:t xml:space="preserve"> 从参考节点出发遍历非参考分支并寻找回接点，可用于没有 GAF 的 rGFA 候选提取。该模式不具有可靠的样本路径、位点频率和等位关系语义，因此输出只表示拓扑候选，不用于样本 presence/absence 推断。</w:t>
       </w:r>
     </w:p>
     <w:bookmarkEnd w:id="38"/>
@@ -3642,8 +2978,6 @@
       </w:r>
       <w:r>
         <w:tab/>
-      </w:r>
-      <w:r>
         <w:t xml:space="preserve">5. 基于所有组装注释的 GFA 节点身份判定</w:t>
       </w:r>
     </w:p>
@@ -3660,8 +2994,6 @@
       </w:r>
       <w:r>
         <w:tab/>
-      </w:r>
-      <w:r>
         <w:t xml:space="preserve">5.1 manifest 数据契约</w:t>
       </w:r>
     </w:p>
@@ -3774,10 +3106,7 @@
               <w:jc w:val="left"/>
             </w:pPr>
             <w:r>
-              <w:t xml:space="preserve">单倍型，默认</w:t>
-            </w:r>
-            <w:r>
-              <w:t xml:space="preserve"> </w:t>
+              <w:t xml:space="preserve">单倍型，默认 </w:t>
             </w:r>
             <w:r>
               <w:rPr>
@@ -3812,10 +3141,7 @@
               <w:jc w:val="left"/>
             </w:pPr>
             <w:r>
-              <w:t xml:space="preserve">RepeatMasker</w:t>
-            </w:r>
-            <w:r>
-              <w:t xml:space="preserve"> </w:t>
+              <w:t xml:space="preserve">RepeatMasker </w:t>
             </w:r>
             <w:r>
               <w:rPr>
@@ -3940,10 +3266,7 @@
               <w:jc w:val="left"/>
             </w:pPr>
             <w:r>
-              <w:t xml:space="preserve">该条目专用 GAF；也可使用全局</w:t>
-            </w:r>
-            <w:r>
-              <w:t xml:space="preserve"> </w:t>
+              <w:t xml:space="preserve">该条目专用 GAF；也可使用全局 </w:t>
             </w:r>
             <w:r>
               <w:rPr>
@@ -4018,10 +3341,7 @@
         <w:pStyle w:val="BodyText"/>
       </w:pPr>
       <w:r>
-        <w:t xml:space="preserve">同一</w:t>
-      </w:r>
-      <w:r>
-        <w:t xml:space="preserve"> </w:t>
+        <w:t xml:space="preserve">同一 </w:t>
       </w:r>
       <w:r>
         <w:rPr>
@@ -4030,10 +3350,7 @@
         <w:t xml:space="preserve">(sample,haplotype)</w:t>
       </w:r>
       <w:r>
-        <w:t xml:space="preserve"> </w:t>
-      </w:r>
-      <w:r>
-        <w:t xml:space="preserve">不得重复。相对路径以 manifest 所在目录解析。所有输入文件写入 provenance，并计算 SHA-256。</w:t>
+        <w:t xml:space="preserve"> 不得重复。相对路径以 manifest 所在目录解析。所有输入文件写入 provenance，并计算 SHA-256。</w:t>
       </w:r>
     </w:p>
     <w:bookmarkEnd w:id="40"/>
@@ -4050,8 +3367,6 @@
       </w:r>
       <w:r>
         <w:tab/>
-      </w:r>
-      <w:r>
         <w:t xml:space="preserve">5.2 注释解析与 feature 分类</w:t>
       </w:r>
     </w:p>
@@ -4060,10 +3375,7 @@
         <w:pStyle w:val="FirstParagraph"/>
       </w:pPr>
       <w:r>
-        <w:t xml:space="preserve">GFF3 的</w:t>
-      </w:r>
-      <w:r>
-        <w:t xml:space="preserve"> </w:t>
+        <w:t xml:space="preserve">GFF3 的 </w:t>
       </w:r>
       <w:r>
         <w:rPr>
@@ -4090,13 +3402,7 @@
         <w:t xml:space="preserve">mobile_element</w:t>
       </w:r>
       <w:r>
-        <w:t xml:space="preserve"> </w:t>
-      </w:r>
-      <w:r>
-        <w:t xml:space="preserve">及包含 transposon/retroelement 语义的 feature 被归为 TE；gene、pseudogene、mRNA、transcript、exon、CDS、intron 和 UTR 被归为 gene structure。若 transcript 只有 exon，按同一 parent、同一 seqid 排序相邻 exon，并以</w:t>
-      </w:r>
-      <w:r>
-        <w:t xml:space="preserve"> </w:t>
+        <w:t xml:space="preserve"> 及包含 transposon/retroelement 语义的 feature 被归为 TE；gene、pseudogene、mRNA、transcript、exon、CDS、intron 和 UTR 被归为 gene structure。若 transcript 只有 exon，按同一 parent、同一 seqid 排序相邻 exon，并以 </w:t>
       </w:r>
       <m:oMath>
         <m:r>
@@ -4106,13 +3412,7 @@
           <m:t>[</m:t>
         </m:r>
         <m:r>
-          <m:t>e</m:t>
-        </m:r>
-        <m:r>
-          <m:t>x</m:t>
-        </m:r>
-        <m:r>
-          <m:t>o</m:t>
+          <m:t>exo</m:t>
         </m:r>
         <m:sSub>
           <m:e>
@@ -4133,13 +3433,7 @@
           <m:t>.</m:t>
         </m:r>
         <m:r>
-          <m:t>e</m:t>
-        </m:r>
-        <m:r>
-          <m:t>n</m:t>
-        </m:r>
-        <m:r>
-          <m:t>d</m:t>
+          <m:t>end</m:t>
         </m:r>
         <m:r>
           <m:rPr>
@@ -4148,13 +3442,7 @@
           <m:t>,</m:t>
         </m:r>
         <m:r>
-          <m:t>e</m:t>
-        </m:r>
-        <m:r>
-          <m:t>x</m:t>
-        </m:r>
-        <m:r>
-          <m:t>o</m:t>
+          <m:t>exo</m:t>
         </m:r>
         <m:sSub>
           <m:e>
@@ -4184,19 +3472,7 @@
           <m:t>.</m:t>
         </m:r>
         <m:r>
-          <m:t>s</m:t>
-        </m:r>
-        <m:r>
-          <m:t>t</m:t>
-        </m:r>
-        <m:r>
-          <m:t>a</m:t>
-        </m:r>
-        <m:r>
-          <m:t>r</m:t>
-        </m:r>
-        <m:r>
-          <m:t>t</m:t>
+          <m:t>start</m:t>
         </m:r>
         <m:r>
           <m:rPr>
@@ -4206,10 +3482,7 @@
         </m:r>
       </m:oMath>
       <w:r>
-        <w:t xml:space="preserve"> </w:t>
-      </w:r>
-      <w:r>
-        <w:t xml:space="preserve">派生 intron。</w:t>
+        <w:t xml:space="preserve"> 派生 intron。</w:t>
       </w:r>
     </w:p>
     <w:p>
@@ -4217,10 +3490,7 @@
         <w:pStyle w:val="BodyText"/>
       </w:pPr>
       <w:r>
-        <w:t xml:space="preserve">RepeatMasker</w:t>
-      </w:r>
-      <w:r>
-        <w:t xml:space="preserve"> </w:t>
+        <w:t xml:space="preserve">RepeatMasker </w:t>
       </w:r>
       <w:r>
         <w:rPr>
@@ -4229,13 +3499,7 @@
         <w:t xml:space="preserve">.out</w:t>
       </w:r>
       <w:r>
-        <w:t xml:space="preserve"> </w:t>
-      </w:r>
-      <w:r>
-        <w:t xml:space="preserve">默认将 repeat class 归为 TE，但</w:t>
-      </w:r>
-      <w:r>
-        <w:t xml:space="preserve"> </w:t>
+        <w:t xml:space="preserve"> 默认将 repeat class 归为 TE，但 </w:t>
       </w:r>
       <w:r>
         <w:rPr>
@@ -4298,13 +3562,7 @@
         <w:t xml:space="preserve">scRNA</w:t>
       </w:r>
       <w:r>
-        <w:t xml:space="preserve"> </w:t>
-      </w:r>
-      <w:r>
-        <w:t xml:space="preserve">和</w:t>
-      </w:r>
-      <w:r>
-        <w:t xml:space="preserve"> </w:t>
+        <w:t xml:space="preserve"> 和 </w:t>
       </w:r>
       <w:r>
         <w:rPr>
@@ -4313,13 +3571,7 @@
         <w:t xml:space="preserve">srpRNA</w:t>
       </w:r>
       <w:r>
-        <w:t xml:space="preserve"> </w:t>
-      </w:r>
-      <w:r>
-        <w:t xml:space="preserve">归为 other。无效坐标、空区间和</w:t>
-      </w:r>
-      <w:r>
-        <w:t xml:space="preserve"> </w:t>
+        <w:t xml:space="preserve"> 归为 other。无效坐标、空区间和 </w:t>
       </w:r>
       <w:r>
         <w:rPr>
@@ -4328,10 +3580,7 @@
         <w:t xml:space="preserve">end&lt;start</w:t>
       </w:r>
       <w:r>
-        <w:t xml:space="preserve"> </w:t>
-      </w:r>
-      <w:r>
-        <w:t xml:space="preserve">记录不进入 feature 集。BED 按 0-based half-open 读取。</w:t>
+        <w:t xml:space="preserve"> 记录不进入 feature 集。BED 按 0-based half-open 读取。</w:t>
       </w:r>
     </w:p>
     <w:p>
@@ -4339,10 +3588,7 @@
         <w:pStyle w:val="BodyText"/>
       </w:pPr>
       <w:r>
-        <w:t xml:space="preserve">feature 使用 1 kb bin 建立索引。区间</w:t>
-      </w:r>
-      <w:r>
-        <w:t xml:space="preserve"> </w:t>
+        <w:t xml:space="preserve">feature 使用 1 kb bin 建立索引。区间 </w:t>
       </w:r>
       <m:oMath>
         <m:r>
@@ -4371,13 +3617,7 @@
         </m:r>
       </m:oMath>
       <w:r>
-        <w:t xml:space="preserve"> </w:t>
-      </w:r>
-      <w:r>
-        <w:t xml:space="preserve">被加入从整数商</w:t>
-      </w:r>
-      <w:r>
-        <w:t xml:space="preserve"> </w:t>
+        <w:t xml:space="preserve"> 被加入从整数商 </w:t>
       </w:r>
       <w:r>
         <w:rPr>
@@ -4386,13 +3626,7 @@
         <w:t xml:space="preserve">s // 1000</w:t>
       </w:r>
       <w:r>
-        <w:t xml:space="preserve"> </w:t>
-      </w:r>
-      <w:r>
-        <w:t xml:space="preserve">到整数商</w:t>
-      </w:r>
-      <w:r>
-        <w:t xml:space="preserve"> </w:t>
+        <w:t xml:space="preserve"> 到整数商 </w:t>
       </w:r>
       <w:r>
         <w:rPr>
@@ -4401,10 +3635,7 @@
         <w:t xml:space="preserve">(e - 1) // 1000</w:t>
       </w:r>
       <w:r>
-        <w:t xml:space="preserve"> </w:t>
-      </w:r>
-      <w:r>
-        <w:t xml:space="preserve">的 bin。查询 occurrence 时只检查相交 bin 内的候选 feature，并以精确区间交集复核。</w:t>
+        <w:t xml:space="preserve"> 的 bin。查询 occurrence 时只检查相交 bin 内的候选 feature，并以精确区间交集复核。</w:t>
       </w:r>
     </w:p>
     <w:bookmarkEnd w:id="41"/>
@@ -4421,8 +3652,6 @@
       </w:r>
       <w:r>
         <w:tab/>
-      </w:r>
-      <w:r>
         <w:t xml:space="preserve">5.3 PGGB occurrence 恢复</w:t>
       </w:r>
     </w:p>
@@ -4431,10 +3660,7 @@
         <w:pStyle w:val="FirstParagraph"/>
       </w:pPr>
       <w:r>
-        <w:t xml:space="preserve">P 路径优先按</w:t>
-      </w:r>
-      <w:r>
-        <w:t xml:space="preserve"> </w:t>
+        <w:t xml:space="preserve">P 路径优先按 </w:t>
       </w:r>
       <w:r>
         <w:rPr>
@@ -4443,13 +3669,7 @@
         <w:t xml:space="preserve">sample#haplotype#contig</w:t>
       </w:r>
       <w:r>
-        <w:t xml:space="preserve"> </w:t>
-      </w:r>
-      <w:r>
-        <w:t xml:space="preserve">解析，也支持 manifest</w:t>
-      </w:r>
-      <w:r>
-        <w:t xml:space="preserve"> </w:t>
+        <w:t xml:space="preserve"> 解析，也支持 manifest </w:t>
       </w:r>
       <w:r>
         <w:rPr>
@@ -4458,10 +3678,7 @@
         <w:t xml:space="preserve">path_prefix</w:t>
       </w:r>
       <w:r>
-        <w:t xml:space="preserve">。每个节点 occurrence 保存 genome interval、node-local interval、方向、path ID 和 evidence。若节点路径起点为</w:t>
-      </w:r>
-      <w:r>
-        <w:t xml:space="preserve"> </w:t>
+        <w:t xml:space="preserve">。每个节点 occurrence 保存 genome interval、node-local interval、方向、path ID 和 evidence。若节点路径起点为 </w:t>
       </w:r>
       <m:oMath>
         <m:sSub>
@@ -4478,10 +3695,7 @@
         </m:sSub>
       </m:oMath>
       <w:r>
-        <w:t xml:space="preserve">、节点长度为</w:t>
-      </w:r>
-      <w:r>
-        <w:t xml:space="preserve"> </w:t>
+        <w:t xml:space="preserve">、节点长度为 </w:t>
       </w:r>
       <m:oMath>
         <m:sSub>
@@ -4498,10 +3712,7 @@
         </m:sSub>
       </m:oMath>
       <w:r>
-        <w:t xml:space="preserve">、与前一节点 overlap 为</w:t>
-      </w:r>
-      <w:r>
-        <w:t xml:space="preserve"> </w:t>
+        <w:t xml:space="preserve">、与前一节点 overlap 为 </w:t>
       </w:r>
       <m:oMath>
         <m:sSub>
@@ -4540,16 +3751,7 @@
         </m:oMathParaPr>
         <m:oMath>
           <m:r>
-            <m:t>s</m:t>
-          </m:r>
-          <m:r>
-            <m:t>t</m:t>
-          </m:r>
-          <m:r>
-            <m:t>a</m:t>
-          </m:r>
-          <m:r>
-            <m:t>r</m:t>
+            <m:t>star</m:t>
           </m:r>
           <m:sSub>
             <m:e>
@@ -4615,13 +3817,7 @@
             <m:t>,</m:t>
           </m:r>
           <m:r>
-            <m:t>  </m:t>
-          </m:r>
-          <m:r>
-            <m:t>e</m:t>
-          </m:r>
-          <m:r>
-            <m:t>n</m:t>
+            <m:t>  en</m:t>
           </m:r>
           <m:sSub>
             <m:e>
@@ -4642,16 +3838,7 @@
             <m:t>=</m:t>
           </m:r>
           <m:r>
-            <m:t>s</m:t>
-          </m:r>
-          <m:r>
-            <m:t>t</m:t>
-          </m:r>
-          <m:r>
-            <m:t>a</m:t>
-          </m:r>
-          <m:r>
-            <m:t>r</m:t>
+            <m:t>star</m:t>
           </m:r>
           <m:sSub>
             <m:e>
@@ -4691,10 +3878,7 @@
         <w:pStyle w:val="FirstParagraph"/>
       </w:pPr>
       <w:r>
-        <w:t xml:space="preserve">W walk 使用</w:t>
-      </w:r>
-      <w:r>
-        <w:t xml:space="preserve"> </w:t>
+        <w:t xml:space="preserve">W walk 使用 </w:t>
       </w:r>
       <w:r>
         <w:rPr>
@@ -4703,13 +3887,7 @@
         <w:t xml:space="preserve">seqStart</w:t>
       </w:r>
       <w:r>
-        <w:t xml:space="preserve"> </w:t>
-      </w:r>
-      <w:r>
-        <w:t xml:space="preserve">作为初始基因组坐标且相邻 overlap 为 0。PGGB 的 P/W 表示完整组装路径；某样本的</w:t>
-      </w:r>
-      <w:r>
-        <w:t xml:space="preserve"> </w:t>
+        <w:t xml:space="preserve"> 作为初始基因组坐标且相邻 overlap 为 0。PGGB 的 P/W 表示完整组装路径；某样本的 </w:t>
       </w:r>
       <w:r>
         <w:rPr>
@@ -4718,13 +3896,7 @@
         <w:t xml:space="preserve">Absent</w:t>
       </w:r>
       <w:r>
-        <w:t xml:space="preserve"> </w:t>
-      </w:r>
-      <w:r>
-        <w:t xml:space="preserve">只有在其所有 manifest haplotype 都具有同 contig 的完整内嵌路径且该节点未出现时才成立，否则为</w:t>
-      </w:r>
-      <w:r>
-        <w:t xml:space="preserve"> </w:t>
+        <w:t xml:space="preserve"> 只有在其所有 manifest haplotype 都具有同 contig 的完整内嵌路径且该节点未出现时才成立，否则为 </w:t>
       </w:r>
       <w:r>
         <w:rPr>
@@ -4750,8 +3922,6 @@
       </w:r>
       <w:r>
         <w:tab/>
-      </w:r>
-      <w:r>
         <w:t xml:space="preserve">5.4 minigraph occurrence 与 gapped CIGAR 变换</w:t>
       </w:r>
     </w:p>
@@ -4760,10 +3930,7 @@
         <w:pStyle w:val="FirstParagraph"/>
       </w:pPr>
       <w:r>
-        <w:t xml:space="preserve">rGFA 的</w:t>
-      </w:r>
-      <w:r>
-        <w:t xml:space="preserve"> </w:t>
+        <w:t xml:space="preserve">rGFA 的 </w:t>
       </w:r>
       <w:r>
         <w:rPr>
@@ -4772,10 +3939,7 @@
         <w:t xml:space="preserve">SN/SO</w:t>
       </w:r>
       <w:r>
-        <w:t xml:space="preserve"> </w:t>
-      </w:r>
-      <w:r>
-        <w:t xml:space="preserve">为节点来源组装提供 origin occurrence。GAF 进一步提供同一节点在其他组装 traversal 中的坐标。默认使用 MAPQ 不低于 20、</w:t>
+        <w:t xml:space="preserve"> 为节点来源组装提供 origin occurrence。GAF 进一步提供同一节点在其他组装 traversal 中的坐标。默认使用 MAPQ 不低于 20、</w:t>
       </w:r>
       <w:r>
         <w:rPr>
@@ -4784,10 +3948,7 @@
         <w:t xml:space="preserve">matches/block_length</w:t>
       </w:r>
       <w:r>
-        <w:t xml:space="preserve"> </w:t>
-      </w:r>
-      <w:r>
-        <w:t xml:space="preserve">不低于 0.90 的 primary GAF。</w:t>
+        <w:t xml:space="preserve"> 不低于 0.90 的 primary GAF。</w:t>
       </w:r>
     </w:p>
     <w:p>
@@ -4795,10 +3956,7 @@
         <w:pStyle w:val="BodyText"/>
       </w:pPr>
       <w:r>
-        <w:t xml:space="preserve">每条 resolved GAF path 先建立 node layout</w:t>
-      </w:r>
-      <w:r>
-        <w:t xml:space="preserve"> </w:t>
+        <w:t xml:space="preserve">每条 resolved GAF path 先建立 node layout </w:t>
       </w:r>
       <m:oMath>
         <m:r>
@@ -4863,10 +4021,7 @@
         </m:r>
       </m:oMath>
       <w:r>
-        <w:t xml:space="preserve">。CIGAR 从</w:t>
-      </w:r>
-      <w:r>
-        <w:t xml:space="preserve"> </w:t>
+        <w:t xml:space="preserve">。CIGAR 从 </w:t>
       </w:r>
       <w:r>
         <w:rPr>
@@ -4875,10 +4030,7 @@
         <w:t xml:space="preserve">path_start</w:t>
       </w:r>
       <w:r>
-        <w:t xml:space="preserve"> </w:t>
-      </w:r>
-      <w:r>
-        <w:t xml:space="preserve">开始扫描：</w:t>
+        <w:t xml:space="preserve"> 开始扫描：</w:t>
       </w:r>
     </w:p>
     <w:p>
@@ -4896,10 +4048,7 @@
         <w:t xml:space="preserve">M/=/X</w:t>
       </w:r>
       <w:r>
-        <w:t xml:space="preserve"> </w:t>
-      </w:r>
-      <w:r>
-        <w:t xml:space="preserve">同时推进 query 和 path，并将该 match block 与 node layout 求交；</w:t>
+        <w:t xml:space="preserve"> 同时推进 query 和 path，并将该 match block 与 node layout 求交；</w:t>
       </w:r>
     </w:p>
     <w:p>
@@ -4917,10 +4066,7 @@
         <w:t xml:space="preserve">I/S</w:t>
       </w:r>
       <w:r>
-        <w:t xml:space="preserve"> </w:t>
-      </w:r>
-      <w:r>
-        <w:t xml:space="preserve">只推进 query；</w:t>
+        <w:t xml:space="preserve"> 只推进 query；</w:t>
       </w:r>
     </w:p>
     <w:p>
@@ -4938,10 +4084,7 @@
         <w:t xml:space="preserve">D/N</w:t>
       </w:r>
       <w:r>
-        <w:t xml:space="preserve"> </w:t>
-      </w:r>
-      <w:r>
-        <w:t xml:space="preserve">只推进 path；</w:t>
+        <w:t xml:space="preserve"> 只推进 path；</w:t>
       </w:r>
     </w:p>
     <w:p>
@@ -4959,10 +4102,7 @@
         <w:t xml:space="preserve">H/P</w:t>
       </w:r>
       <w:r>
-        <w:t xml:space="preserve"> </w:t>
-      </w:r>
-      <w:r>
-        <w:t xml:space="preserve">不推进。</w:t>
+        <w:t xml:space="preserve"> 不推进。</w:t>
       </w:r>
     </w:p>
     <w:p>
@@ -4970,10 +4110,7 @@
         <w:pStyle w:val="FirstParagraph"/>
       </w:pPr>
       <w:r>
-        <w:t xml:space="preserve">对正链记录，match block 内 path 偏移</w:t>
-      </w:r>
-      <w:r>
-        <w:t xml:space="preserve"> </w:t>
+        <w:t xml:space="preserve">对正链记录，match block 内 path 偏移 </w:t>
       </w:r>
       <m:oMath>
         <m:r>
@@ -4981,10 +4118,7 @@
         </m:r>
       </m:oMath>
       <w:r>
-        <w:t xml:space="preserve">、交集长度</w:t>
-      </w:r>
-      <w:r>
-        <w:t xml:space="preserve"> </w:t>
+        <w:t xml:space="preserve">、交集长度 </w:t>
       </w:r>
       <m:oMath>
         <m:r>
@@ -4992,10 +4126,7 @@
         </m:r>
       </m:oMath>
       <w:r>
-        <w:t xml:space="preserve"> </w:t>
-      </w:r>
-      <w:r>
-        <w:t xml:space="preserve">映射到：</w:t>
+        <w:t xml:space="preserve"> 映射到：</w:t>
       </w:r>
     </w:p>
     <w:p>
@@ -5014,22 +4145,7 @@
             <m:t>[</m:t>
           </m:r>
           <m:r>
-            <m:t>q</m:t>
-          </m:r>
-          <m:r>
-            <m:t>s</m:t>
-          </m:r>
-          <m:r>
-            <m:t>t</m:t>
-          </m:r>
-          <m:r>
-            <m:t>a</m:t>
-          </m:r>
-          <m:r>
-            <m:t>r</m:t>
-          </m:r>
-          <m:r>
-            <m:t>t</m:t>
+            <m:t>qstart</m:t>
           </m:r>
           <m:r>
             <m:rPr>
@@ -5045,28 +4161,7 @@
             </m:e>
             <m:sub>
               <m:r>
-                <m:t>c</m:t>
-              </m:r>
-              <m:r>
-                <m:t>o</m:t>
-              </m:r>
-              <m:r>
-                <m:t>n</m:t>
-              </m:r>
-              <m:r>
-                <m:t>s</m:t>
-              </m:r>
-              <m:r>
-                <m:t>u</m:t>
-              </m:r>
-              <m:r>
-                <m:t>m</m:t>
-              </m:r>
-              <m:r>
-                <m:t>e</m:t>
-              </m:r>
-              <m:r>
-                <m:t>d</m:t>
+                <m:t>consumed</m:t>
               </m:r>
             </m:sub>
           </m:sSub>
@@ -5086,25 +4181,7 @@
             <m:t>,</m:t>
           </m:r>
           <m:r>
-            <m:t> </m:t>
-          </m:r>
-          <m:r>
-            <m:t>q</m:t>
-          </m:r>
-          <m:r>
-            <m:t>s</m:t>
-          </m:r>
-          <m:r>
-            <m:t>t</m:t>
-          </m:r>
-          <m:r>
-            <m:t>a</m:t>
-          </m:r>
-          <m:r>
-            <m:t>r</m:t>
-          </m:r>
-          <m:r>
-            <m:t>t</m:t>
+            <m:t> qstart</m:t>
           </m:r>
           <m:r>
             <m:rPr>
@@ -5120,28 +4197,7 @@
             </m:e>
             <m:sub>
               <m:r>
-                <m:t>c</m:t>
-              </m:r>
-              <m:r>
-                <m:t>o</m:t>
-              </m:r>
-              <m:r>
-                <m:t>n</m:t>
-              </m:r>
-              <m:r>
-                <m:t>s</m:t>
-              </m:r>
-              <m:r>
-                <m:t>u</m:t>
-              </m:r>
-              <m:r>
-                <m:t>m</m:t>
-              </m:r>
-              <m:r>
-                <m:t>e</m:t>
-              </m:r>
-              <m:r>
-                <m:t>d</m:t>
+                <m:t>consumed</m:t>
               </m:r>
             </m:sub>
           </m:sSub>
@@ -5196,16 +4252,7 @@
             <m:t>[</m:t>
           </m:r>
           <m:r>
-            <m:t>q</m:t>
-          </m:r>
-          <m:r>
-            <m:t>e</m:t>
-          </m:r>
-          <m:r>
-            <m:t>n</m:t>
-          </m:r>
-          <m:r>
-            <m:t>d</m:t>
+            <m:t>qend</m:t>
           </m:r>
           <m:r>
             <m:rPr>
@@ -5221,28 +4268,7 @@
             </m:e>
             <m:sub>
               <m:r>
-                <m:t>c</m:t>
-              </m:r>
-              <m:r>
-                <m:t>o</m:t>
-              </m:r>
-              <m:r>
-                <m:t>n</m:t>
-              </m:r>
-              <m:r>
-                <m:t>s</m:t>
-              </m:r>
-              <m:r>
-                <m:t>u</m:t>
-              </m:r>
-              <m:r>
-                <m:t>m</m:t>
-              </m:r>
-              <m:r>
-                <m:t>e</m:t>
-              </m:r>
-              <m:r>
-                <m:t>d</m:t>
+                <m:t>consumed</m:t>
               </m:r>
             </m:sub>
           </m:sSub>
@@ -5271,19 +4297,7 @@
             <m:t>,</m:t>
           </m:r>
           <m:r>
-            <m:t> </m:t>
-          </m:r>
-          <m:r>
-            <m:t>q</m:t>
-          </m:r>
-          <m:r>
-            <m:t>e</m:t>
-          </m:r>
-          <m:r>
-            <m:t>n</m:t>
-          </m:r>
-          <m:r>
-            <m:t>d</m:t>
+            <m:t> qend</m:t>
           </m:r>
           <m:r>
             <m:rPr>
@@ -5299,28 +4313,7 @@
             </m:e>
             <m:sub>
               <m:r>
-                <m:t>c</m:t>
-              </m:r>
-              <m:r>
-                <m:t>o</m:t>
-              </m:r>
-              <m:r>
-                <m:t>n</m:t>
-              </m:r>
-              <m:r>
-                <m:t>s</m:t>
-              </m:r>
-              <m:r>
-                <m:t>u</m:t>
-              </m:r>
-              <m:r>
-                <m:t>m</m:t>
-              </m:r>
-              <m:r>
-                <m:t>e</m:t>
-              </m:r>
-              <m:r>
-                <m:t>d</m:t>
+                <m:t>consumed</m:t>
               </m:r>
             </m:sub>
           </m:sSub>
@@ -5347,10 +4340,7 @@
         <w:pStyle w:val="FirstParagraph"/>
       </w:pPr>
       <w:r>
-        <w:t xml:space="preserve">若 node step 为正向，node-local 区间是</w:t>
-      </w:r>
-      <w:r>
-        <w:t xml:space="preserve"> </w:t>
+        <w:t xml:space="preserve">若 node step 为正向，node-local 区间是 </w:t>
       </w:r>
       <w:r>
         <w:rPr>
@@ -5359,10 +4349,7 @@
         <w:t xml:space="preserve">[overlap_start-node_left, overlap_end-node_left)</w:t>
       </w:r>
       <w:r>
-        <w:t xml:space="preserve">；若 step 为反向，则为</w:t>
-      </w:r>
-      <w:r>
-        <w:t xml:space="preserve"> </w:t>
+        <w:t xml:space="preserve">；若 step 为反向，则为 </w:t>
       </w:r>
       <w:r>
         <w:rPr>
@@ -5371,10 +4358,7 @@
         <w:t xml:space="preserve">[node_right-overlap_end, node_right-overlap_start)</w:t>
       </w:r>
       <w:r>
-        <w:t xml:space="preserve">。负链 query 还会翻转 occurrence 方向。连续</w:t>
-      </w:r>
-      <w:r>
-        <w:t xml:space="preserve"> </w:t>
+        <w:t xml:space="preserve">。负链 query 还会翻转 occurrence 方向。连续 </w:t>
       </w:r>
       <w:r>
         <w:rPr>
@@ -5383,10 +4367,7 @@
         <w:t xml:space="preserve">M/=/X</w:t>
       </w:r>
       <w:r>
-        <w:t xml:space="preserve"> </w:t>
-      </w:r>
-      <w:r>
-        <w:t xml:space="preserve">均是 1:1 坐标变换，因此合并为一个 match run；indel 仍作为线性块边界保留。</w:t>
+        <w:t xml:space="preserve"> 均是 1:1 坐标变换，因此合并为一个 match run；indel 仍作为线性块边界保留。</w:t>
       </w:r>
     </w:p>
     <w:p>
@@ -5394,10 +4375,7 @@
         <w:pStyle w:val="BodyText"/>
       </w:pPr>
       <w:r>
-        <w:t xml:space="preserve">一个真实 traversal 中的同一 node 可能由 indel 拆为多个 occurrence block。节点支持率按</w:t>
-      </w:r>
-      <w:r>
-        <w:t xml:space="preserve"> </w:t>
+        <w:t xml:space="preserve">一个真实 traversal 中的同一 node 可能由 indel 拆为多个 occurrence block。节点支持率按 </w:t>
       </w:r>
       <w:r>
         <w:rPr>
@@ -5406,10 +4384,7 @@
         <w:t xml:space="preserve">(entry,seqid,node_id,node_step,path_id)</w:t>
       </w:r>
       <w:r>
-        <w:t xml:space="preserve"> </w:t>
-      </w:r>
-      <w:r>
-        <w:t xml:space="preserve">context 聚合，而不是按 block 数投票，使 CIGAR 的表示碎片数不影响 TE 支持率和 disagreement。</w:t>
+        <w:t xml:space="preserve"> context 聚合，而不是按 block 数投票，使 CIGAR 的表示碎片数不影响 TE 支持率和 disagreement。</w:t>
       </w:r>
     </w:p>
     <w:bookmarkEnd w:id="43"/>
@@ -5426,8 +4401,6 @@
       </w:r>
       <w:r>
         <w:tab/>
-      </w:r>
-      <w:r>
         <w:t xml:space="preserve">5.5 feature 到 node 的方向变换</w:t>
       </w:r>
     </w:p>
@@ -5436,10 +4409,7 @@
         <w:pStyle w:val="FirstParagraph"/>
       </w:pPr>
       <w:r>
-        <w:t xml:space="preserve">对 feature</w:t>
-      </w:r>
-      <w:r>
-        <w:t xml:space="preserve"> </w:t>
+        <w:t xml:space="preserve">对 feature </w:t>
       </w:r>
       <m:oMath>
         <m:r>
@@ -5486,13 +4456,7 @@
         </m:r>
       </m:oMath>
       <w:r>
-        <w:t xml:space="preserve"> </w:t>
-      </w:r>
-      <w:r>
-        <w:t xml:space="preserve">与 occurrence genome 区间</w:t>
-      </w:r>
-      <w:r>
-        <w:t xml:space="preserve"> </w:t>
+        <w:t xml:space="preserve"> 与 occurrence genome 区间 </w:t>
       </w:r>
       <m:oMath>
         <m:r>
@@ -5573,25 +4537,7 @@
             <m:rPr>
               <m:sty m:val="p"/>
             </m:rPr>
-            <m:t>)</m:t>
-          </m:r>
-          <m:r>
-            <m:rPr>
-              <m:sty m:val="p"/>
-            </m:rPr>
-            <m:t>=</m:t>
-          </m:r>
-          <m:r>
-            <m:rPr>
-              <m:sty m:val="p"/>
-            </m:rPr>
-            <m:t>[</m:t>
-          </m:r>
-          <m:r>
-            <m:rPr>
-              <m:sty m:val="p"/>
-            </m:rPr>
-            <m:t>max</m:t>
+            <m:t>)=[max</m:t>
           </m:r>
           <m:d>
             <m:dPr>
@@ -5637,13 +4583,7 @@
             <m:rPr>
               <m:sty m:val="p"/>
             </m:rPr>
-            <m:t>,</m:t>
-          </m:r>
-          <m:r>
-            <m:rPr>
-              <m:sty m:val="p"/>
-            </m:rPr>
-            <m:t>min</m:t>
+            <m:t>,min</m:t>
           </m:r>
           <m:d>
             <m:dPr>
@@ -5699,10 +4639,7 @@
         <w:pStyle w:val="FirstParagraph"/>
       </w:pPr>
       <w:r>
-        <w:t xml:space="preserve">若</w:t>
-      </w:r>
-      <w:r>
-        <w:t xml:space="preserve"> </w:t>
+        <w:t xml:space="preserve">若 </w:t>
       </w:r>
       <m:oMath>
         <m:r>
@@ -5719,10 +4656,7 @@
         </m:r>
       </m:oMath>
       <w:r>
-        <w:t xml:space="preserve"> </w:t>
-      </w:r>
-      <w:r>
-        <w:t xml:space="preserve">则无投影。正向 occurrence 的 node-local 坐标为：</w:t>
+        <w:t xml:space="preserve"> 则无投影。正向 occurrence 的 node-local 坐标为：</w:t>
       </w:r>
     </w:p>
     <w:p>
@@ -6017,8 +4951,6 @@
       </w:r>
       <w:r>
         <w:tab/>
-      </w:r>
-      <w:r>
         <w:t xml:space="preserve">5.6 occurrence、context 与 node 身份</w:t>
       </w:r>
     </w:p>
@@ -6035,10 +4967,7 @@
         <w:pStyle w:val="BodyText"/>
       </w:pPr>
       <w:r>
-        <w:t xml:space="preserve">节点汇总先对所有 projected TE 的 node-local 区间求并集。令并集覆盖的碱基数为</w:t>
-      </w:r>
-      <w:r>
-        <w:t xml:space="preserve"> </w:t>
+        <w:t xml:space="preserve">节点汇总先对所有 projected TE 的 node-local 区间求并集。令并集覆盖的碱基数为 </w:t>
       </w:r>
       <m:oMath>
         <m:sSub>
@@ -6049,19 +4978,13 @@
           </m:e>
           <m:sub>
             <m:r>
-              <m:t>T</m:t>
-            </m:r>
-            <m:r>
-              <m:t>E</m:t>
+              <m:t>TE</m:t>
             </m:r>
           </m:sub>
         </m:sSub>
       </m:oMath>
       <w:r>
-        <w:t xml:space="preserve">，节点长度为</w:t>
-      </w:r>
-      <w:r>
-        <w:t xml:space="preserve"> </w:t>
+        <w:t xml:space="preserve">，节点长度为 </w:t>
       </w:r>
       <m:oMath>
         <m:sSub>
@@ -6072,16 +4995,7 @@
           </m:e>
           <m:sub>
             <m:r>
-              <m:t>n</m:t>
-            </m:r>
-            <m:r>
-              <m:t>o</m:t>
-            </m:r>
-            <m:r>
-              <m:t>d</m:t>
-            </m:r>
-            <m:r>
-              <m:t>e</m:t>
+              <m:t>node</m:t>
             </m:r>
           </m:sub>
         </m:sSub>
@@ -6107,10 +5021,7 @@
             </m:e>
             <m:sub>
               <m:r>
-                <m:t>T</m:t>
-              </m:r>
-              <m:r>
-                <m:t>E</m:t>
+                <m:t>TE</m:t>
               </m:r>
             </m:sub>
           </m:sSub>
@@ -6133,10 +5044,7 @@
                 </m:e>
                 <m:sub>
                   <m:r>
-                    <m:t>T</m:t>
-                  </m:r>
-                  <m:r>
-                    <m:t>E</m:t>
+                    <m:t>TE</m:t>
                   </m:r>
                 </m:sub>
               </m:sSub>
@@ -6150,16 +5058,7 @@
                 </m:e>
                 <m:sub>
                   <m:r>
-                    <m:t>n</m:t>
-                  </m:r>
-                  <m:r>
-                    <m:t>o</m:t>
-                  </m:r>
-                  <m:r>
-                    <m:t>d</m:t>
-                  </m:r>
-                  <m:r>
-                    <m:t>e</m:t>
+                    <m:t>node</m:t>
                   </m:r>
                 </m:sub>
               </m:sSub>
@@ -6185,10 +5084,7 @@
         </w:numPr>
       </w:pPr>
       <w:r>
-        <w:t xml:space="preserve">同一 occurrence block 的 TE 与 CDS 有碱基重叠时为</w:t>
-      </w:r>
-      <w:r>
-        <w:t xml:space="preserve"> </w:t>
+        <w:t xml:space="preserve">同一 occurrence block 的 TE 与 CDS 有碱基重叠时为 </w:t>
       </w:r>
       <w:r>
         <w:rPr>
@@ -6209,10 +5105,7 @@
         </w:numPr>
       </w:pPr>
       <w:r>
-        <w:t xml:space="preserve">节点同时具有 TE 与 gene structure，或完整注释的 traversal context 对 TE 与非 TE 判断不一致时为</w:t>
-      </w:r>
-      <w:r>
-        <w:t xml:space="preserve"> </w:t>
+        <w:t xml:space="preserve">节点同时具有 TE 与 gene structure，或完整注释的 traversal context 对 TE 与非 TE 判断不一致时为 </w:t>
       </w:r>
       <w:r>
         <w:rPr>
@@ -6241,10 +5134,7 @@
           </m:e>
           <m:sub>
             <m:r>
-              <m:t>T</m:t>
-            </m:r>
-            <m:r>
-              <m:t>E</m:t>
+              <m:t>TE</m:t>
             </m:r>
           </m:sub>
         </m:sSub>
@@ -6259,13 +5149,7 @@
         </m:r>
       </m:oMath>
       <w:r>
-        <w:t xml:space="preserve"> </w:t>
-      </w:r>
-      <w:r>
-        <w:t xml:space="preserve">且 TE context support 不低于 0.5 时为</w:t>
-      </w:r>
-      <w:r>
-        <w:t xml:space="preserve"> </w:t>
+        <w:t xml:space="preserve"> 且 TE context support 不低于 0.5 时为 </w:t>
       </w:r>
       <w:r>
         <w:rPr>
@@ -6294,10 +5178,7 @@
           </m:e>
           <m:sub>
             <m:r>
-              <m:t>T</m:t>
-            </m:r>
-            <m:r>
-              <m:t>E</m:t>
+              <m:t>TE</m:t>
             </m:r>
           </m:sub>
         </m:sSub>
@@ -6312,13 +5193,7 @@
         </m:r>
       </m:oMath>
       <w:r>
-        <w:t xml:space="preserve"> </w:t>
-      </w:r>
-      <w:r>
-        <w:t xml:space="preserve">或存在任意 TE 投影时为</w:t>
-      </w:r>
-      <w:r>
-        <w:t xml:space="preserve"> </w:t>
+        <w:t xml:space="preserve"> 或存在任意 TE 投影时为 </w:t>
       </w:r>
       <w:r>
         <w:rPr>
@@ -6339,10 +5214,7 @@
         </w:numPr>
       </w:pPr>
       <w:r>
-        <w:t xml:space="preserve">无 TE 且存在 gene structure 时为</w:t>
-      </w:r>
-      <w:r>
-        <w:t xml:space="preserve"> </w:t>
+        <w:t xml:space="preserve">无 TE 且存在 gene structure 时为 </w:t>
       </w:r>
       <w:r>
         <w:rPr>
@@ -6363,10 +5235,7 @@
         </w:numPr>
       </w:pPr>
       <w:r>
-        <w:t xml:space="preserve">无 TE/gene structure 且存在 callable context 时为</w:t>
-      </w:r>
-      <w:r>
-        <w:t xml:space="preserve"> </w:t>
+        <w:t xml:space="preserve">无 TE/gene structure 且存在 callable context 时为 </w:t>
       </w:r>
       <w:r>
         <w:rPr>
@@ -6387,10 +5256,7 @@
         </w:numPr>
       </w:pPr>
       <w:r>
-        <w:t xml:space="preserve">无 callable 证据时为</w:t>
-      </w:r>
-      <w:r>
-        <w:t xml:space="preserve"> </w:t>
+        <w:t xml:space="preserve">无 callable 证据时为 </w:t>
       </w:r>
       <w:r>
         <w:rPr>
@@ -6407,10 +5273,7 @@
         <w:pStyle w:val="FirstParagraph"/>
       </w:pPr>
       <w:r>
-        <w:t xml:space="preserve">样本状态使用</w:t>
-      </w:r>
-      <w:r>
-        <w:t xml:space="preserve"> </w:t>
+        <w:t xml:space="preserve">样本状态使用 </w:t>
       </w:r>
       <w:r>
         <w:rPr>
@@ -6419,10 +5282,7 @@
         <w:t xml:space="preserve">TE/PartialTE/NonTE/Unknown/Absent/NA</w:t>
       </w:r>
       <w:r>
-        <w:t xml:space="preserve">，这些状态不能合并。特别地，rGFA 中未观察到高质量 traversal 只得到</w:t>
-      </w:r>
-      <w:r>
-        <w:t xml:space="preserve"> </w:t>
+        <w:t xml:space="preserve">，这些状态不能合并。特别地，rGFA 中未观察到高质量 traversal 只得到 </w:t>
       </w:r>
       <w:r>
         <w:rPr>
@@ -6448,8 +5308,6 @@
       </w:r>
       <w:r>
         <w:tab/>
-      </w:r>
-      <w:r>
         <w:t xml:space="preserve">5.7 输出文件</w:t>
       </w:r>
     </w:p>
@@ -6779,8 +5637,6 @@
       </w:r>
       <w:r>
         <w:tab/>
-      </w:r>
-      <w:r>
         <w:t xml:space="preserve">6. Look4LTRs 结构轨道</w:t>
       </w:r>
     </w:p>
@@ -6789,67 +5645,7 @@
         <w:pStyle w:val="FirstParagraph"/>
       </w:pPr>
       <w:r>
-        <w:rPr>
-          <w:rStyle w:val="VerbatimChar"/>
-        </w:rPr>
-        <w:t xml:space="preserve">LTR_detect</w:t>
-      </w:r>
-      <w:r>
-        <w:t xml:space="preserve"> </w:t>
-      </w:r>
-      <w:r>
-        <w:t xml:space="preserve">在规范化基因组上识别具有长末端重复结构的候选，并输出</w:t>
-      </w:r>
-      <w:r>
-        <w:t xml:space="preserve"> </w:t>
-      </w:r>
-      <w:r>
-        <w:rPr>
-          <w:rStyle w:val="VerbatimChar"/>
-        </w:rPr>
-        <w:t xml:space="preserve">.rtr</w:t>
-      </w:r>
-      <w:r>
-        <w:t xml:space="preserve">。</w:t>
-      </w:r>
-      <w:r>
-        <w:rPr>
-          <w:rStyle w:val="VerbatimChar"/>
-        </w:rPr>
-        <w:t xml:space="preserve">build_ltr_library.py</w:t>
-      </w:r>
-      <w:r>
-        <w:t xml:space="preserve"> </w:t>
-      </w:r>
-      <w:r>
-        <w:t xml:space="preserve">根据图分组和家族归属建立共识。分块结果通过</w:t>
-      </w:r>
-      <w:r>
-        <w:t xml:space="preserve"> </w:t>
-      </w:r>
-      <w:r>
-        <w:rPr>
-          <w:rStyle w:val="VerbatimChar"/>
-        </w:rPr>
-        <w:t xml:space="preserve">cd-hit-est -c 0.8 -aS 0.8</w:t>
-      </w:r>
-      <w:r>
-        <w:t xml:space="preserve"> </w:t>
-      </w:r>
-      <w:r>
-        <w:t xml:space="preserve">合并为</w:t>
-      </w:r>
-      <w:r>
-        <w:t xml:space="preserve"> </w:t>
-      </w:r>
-      <w:r>
-        <w:rPr>
-          <w:rStyle w:val="VerbatimChar"/>
-        </w:rPr>
-        <w:t xml:space="preserve">Look4LTRs/consensus_lib/ltr_library.fa</w:t>
-      </w:r>
-      <w:r>
-        <w:t xml:space="preserve">。</w:t>
+        <w:t xml:space="preserve">LTR_detect 在规范化基因组上识别具有左右 LTR 结构的候选并输出 .rtr。大于 5 GB 的输入可分块检测，但所有 .rtr 在一次 build_ltr_library.py 调用中联合建库；文件来源写入内部家族键，从而区分不同分块中的局部 element ID/GraphGroup ID，并且完整基因组只执行一次 FastGA。</w:t>
       </w:r>
     </w:p>
     <w:p>
@@ -6857,7 +5653,47 @@
         <w:pStyle w:val="BodyText"/>
       </w:pPr>
       <w:r>
-        <w:t xml:space="preserve">该轨道的证据来自 LTR 边界和内部结构，因此优先覆盖结构保存良好且相对年轻的 LTR retrotransposon。结构破损、嵌套或高度分化的候选由 mdl-repeat 和 TE-looker 补充。80% identity 和 80% shorter-sequence coverage 用于轨道内去除明显重复共识，同时保留分化家族。</w:t>
+        <w:t xml:space="preserve">完整元件按结构证据分层：LTR identity≥0.85且同时存在PPT、TSD为Tier 1；identity≥0.70且存在PPT为Tier 2；其余完整元件为Tier 3；无右LTR为solo。基因组FASTA文件≥250 MB或原始GraphGroup≥2500时进入scalable mode，否则为sensitive mode。sensitive mode保留全部GraphGroup；scalable mode要求家族含至少两个完整元件，或至少一个Tier 1/2完整元件。solo可为合格家族补充LTR观测，但solo-only组和无第二拷贝证据的Tier-3单例在scalable mode中门控。两个规模触发值和低证据单例策略均可由CLI覆盖。</w:t>
+      </w:r>
+    </w:p>
+    <w:p>
+      <w:pPr>
+        <w:pStyle w:val="BodyText"/>
+      </w:pPr>
+      <w:r>
+        <w:t xml:space="preserve">左右 LTR 和内部区分别提取；.rtr 报告的嵌套元件区间从宿主内部区中扣除。每个家族最多选 identity最高的20个元件用于 LTR MSA，最多选10条内部序列。MAFFT 比对后按 LTR identity加权逐列投票，非gap权重超过总权重0.5时保留该列。初始完整共识为左右对称的 LTR + interior + LTR。</w:t>
+      </w:r>
+    </w:p>
+    <w:p>
+      <w:pPr>
+        <w:pStyle w:val="BodyText"/>
+      </w:pPr>
+      <w:r>
+        <w:t xml:space="preserve">scalable mode默认先经cd-hit-est -c 0.8 -aS 0.8 -d 0去冗余，sensitive mode默认跳过该固定开销；--precluster和--no-precluster只覆盖预聚类选择，不改变scale mode、证据门控或FastGA查询选择。代表序列首先继承Look4LTRs完整元件坐标。sensitive mode将全部代表送入FastGA，以维持小基因组中的跨GraphGroup连接；scalable mode只搜索少于两个非重叠已知loci的代表。sensitive mode使用identity≥0.60、最短比对200 bp和query coverage≥0.30；scalable mode使用0.70、300 bp和0.50。每个query在流入PAF时仅保留按identity×query_coverage排序的前30个命中，所以保存的PAF和下游区间数有严格上界。只有FastGA序列比对命中用于family union；.rtr完整区间仅用于copy support和序列提取，避免嵌套/相邻元件造成过度union。FastGA默认7200 s硬超时，并输出每分钟心跳；超时后使用.rtr已知拷贝继续完成，未取得第二个非重叠locus的低支持单例由copy QC淘汰。</w:t>
+      </w:r>
+    </w:p>
+    <w:p>
+      <w:pPr>
+        <w:pStyle w:val="BodyText"/>
+      </w:pPr>
+      <w:r>
+        <w:t xml:space="preserve">不同代表若命中同一基因组区间且重叠达到较短区间的50%，则由union-find合并。每组最多保留30个去重loci作为copy support，校正MSA从这些loci的序列中确定性均匀抽取最多10条；header copy数仍按全部loci计算。不足两个拷贝时回退到组内最长初始共识。长度小于200 bp、N比例大于0.25或拷贝数小于2的序列被过滤，之后再以80% identity和80% shorter-sequence coverage去冗余，形成 Look4LTRs/consensus_lib/ltr_library.fa。--no-extend直接使用.rtr已知完整元件数执行copy gate。</w:t>
+      </w:r>
+    </w:p>
+    <w:p>
+      <w:pPr>
+        <w:pStyle w:val="BodyText"/>
+      </w:pPr>
+      <w:r>
+        <w:t xml:space="preserve">FastGA的有界PAF、查询参数指纹和基因组索引指纹保存在work/。仅当query哈希、基因组路径、大小、mtime和阈值完全相同才复用；大型MSA目录在成功后移除，--clean-work用于显式删除全部断点。Pan_TE实时转发builder日志。</w:t>
+      </w:r>
+    </w:p>
+    <w:p>
+      <w:pPr>
+        <w:pStyle w:val="BodyText"/>
+      </w:pPr>
+      <w:r>
+        <w:t xml:space="preserve">该轨道优先覆盖结构保存良好且相对年轻的LTR retrotransposon；结构破损、严重截断或高度分化的候选由mdl-repeat和TE-looker补充。</w:t>
       </w:r>
     </w:p>
     <w:bookmarkEnd w:id="48"/>
@@ -6874,8 +5710,6 @@
       </w:r>
       <w:r>
         <w:tab/>
-      </w:r>
-      <w:r>
         <w:t xml:space="preserve">7. mdl-repeat 的 MDL 重复发现</w:t>
       </w:r>
     </w:p>
@@ -6892,8 +5726,6 @@
       </w:r>
       <w:r>
         <w:tab/>
-      </w:r>
-      <w:r>
         <w:t xml:space="preserve">7.1 最小描述长度目标</w:t>
       </w:r>
     </w:p>
@@ -6902,10 +5734,7 @@
         <w:pStyle w:val="FirstParagraph"/>
       </w:pPr>
       <w:r>
-        <w:t xml:space="preserve">mdl-repeat 使用 Minimum Description Length 原则比较候选家族模型</w:t>
-      </w:r>
-      <w:r>
-        <w:t xml:space="preserve"> </w:t>
+        <w:t xml:space="preserve">mdl-repeat 使用 Minimum Description Length 原则比较候选家族模型 </w:t>
       </w:r>
       <m:oMath>
         <m:r>
@@ -6913,13 +5742,7 @@
         </m:r>
       </m:oMath>
       <w:r>
-        <w:t xml:space="preserve"> </w:t>
-      </w:r>
-      <w:r>
-        <w:t xml:space="preserve">对观测序列</w:t>
-      </w:r>
-      <w:r>
-        <w:t xml:space="preserve"> </w:t>
+        <w:t xml:space="preserve"> 对观测序列 </w:t>
       </w:r>
       <m:oMath>
         <m:r>
@@ -6927,10 +5750,7 @@
         </m:r>
       </m:oMath>
       <w:r>
-        <w:t xml:space="preserve"> </w:t>
-      </w:r>
-      <w:r>
-        <w:t xml:space="preserve">的压缩能力：</w:t>
+        <w:t xml:space="preserve"> 的压缩能力：</w:t>
       </w:r>
     </w:p>
     <w:p>
@@ -6950,19 +5770,7 @@
             </m:e>
             <m:sub>
               <m:r>
-                <m:t>t</m:t>
-              </m:r>
-              <m:r>
-                <m:t>o</m:t>
-              </m:r>
-              <m:r>
-                <m:t>t</m:t>
-              </m:r>
-              <m:r>
-                <m:t>a</m:t>
-              </m:r>
-              <m:r>
-                <m:t>l</m:t>
+                <m:t>total</m:t>
               </m:r>
             </m:sub>
           </m:sSub>
@@ -7045,10 +5853,7 @@
         </m:d>
       </m:oMath>
       <w:r>
-        <w:t xml:space="preserve"> </w:t>
-      </w:r>
-      <w:r>
-        <w:t xml:space="preserve">描述共识、家族参数和模型本身；</w:t>
+        <w:t xml:space="preserve"> 描述共识、家族参数和模型本身；</w:t>
       </w:r>
       <m:oMath>
         <m:r>
@@ -7078,13 +5883,7 @@
         </m:d>
       </m:oMath>
       <w:r>
-        <w:t xml:space="preserve"> </w:t>
-      </w:r>
-      <w:r>
-        <w:t xml:space="preserve">描述所有拷贝相对共识的差异、位置和未解释序列。真实重复家族使“一个模型加多个差异编码”短于逐段原样编码；过多的偶然家族会增大</w:t>
-      </w:r>
-      <w:r>
-        <w:t xml:space="preserve"> </w:t>
+        <w:t xml:space="preserve"> 描述所有拷贝相对共识的差异、位置和未解释序列。真实重复家族使“一个模型加多个差异编码”短于逐段原样编码；过多的偶然家族会增大 </w:t>
       </w:r>
       <m:oMath>
         <m:r>
@@ -7105,10 +5904,7 @@
         </m:d>
       </m:oMath>
       <w:r>
-        <w:t xml:space="preserve">，过度合并分化序列会增大</w:t>
-      </w:r>
-      <w:r>
-        <w:t xml:space="preserve"> </w:t>
+        <w:t xml:space="preserve">，过度合并分化序列会增大 </w:t>
       </w:r>
       <m:oMath>
         <m:r>
@@ -7146,10 +5942,7 @@
         <w:pStyle w:val="BodyText"/>
       </w:pPr>
       <w:r>
-        <w:t xml:space="preserve">Pan_TE 使用 mdl-repeat 输出 header 中的</w:t>
-      </w:r>
-      <w:r>
-        <w:t xml:space="preserve"> </w:t>
+        <w:t xml:space="preserve">Pan_TE 使用 mdl-repeat 输出 header 中的 </w:t>
       </w:r>
       <w:r>
         <w:rPr>
@@ -7194,13 +5987,7 @@
         <w:t xml:space="preserve">tier</w:t>
       </w:r>
       <w:r>
-        <w:t xml:space="preserve"> </w:t>
-      </w:r>
-      <w:r>
-        <w:t xml:space="preserve">和</w:t>
-      </w:r>
-      <w:r>
-        <w:t xml:space="preserve"> </w:t>
+        <w:t xml:space="preserve"> 和 </w:t>
       </w:r>
       <w:r>
         <w:rPr>
@@ -7226,8 +6013,6 @@
       </w:r>
       <w:r>
         <w:tab/>
-      </w:r>
-      <w:r>
         <w:t xml:space="preserve">7.2 低复杂度预掩蔽</w:t>
       </w:r>
     </w:p>
@@ -7242,13 +6027,7 @@
         <w:t xml:space="preserve">build_mdl</w:t>
       </w:r>
       <w:r>
-        <w:t xml:space="preserve"> </w:t>
-      </w:r>
-      <w:r>
-        <w:t xml:space="preserve">先运行</w:t>
-      </w:r>
-      <w:r>
-        <w:t xml:space="preserve"> </w:t>
+        <w:t xml:space="preserve"> 先运行 </w:t>
       </w:r>
       <w:r>
         <w:rPr>
@@ -7257,10 +6036,7 @@
         <w:t xml:space="preserve">dustmasker</w:t>
       </w:r>
       <w:r>
-        <w:t xml:space="preserve">，再以 TRF 参数</w:t>
-      </w:r>
-      <w:r>
-        <w:t xml:space="preserve"> </w:t>
+        <w:t xml:space="preserve">，再以 TRF 参数 </w:t>
       </w:r>
       <w:r>
         <w:rPr>
@@ -7269,10 +6045,7 @@
         <w:t xml:space="preserve">2 7 7 80 10 50 500 -m -h</w:t>
       </w:r>
       <w:r>
-        <w:t xml:space="preserve"> </w:t>
-      </w:r>
-      <w:r>
-        <w:t xml:space="preserve">掩蔽串联重复。参数依次表示 match reward、mismatch penalty、indel penalty、match probability、indel probability、minimum score 和 maximum period。预掩蔽降低微卫星、同聚体和简单重复对 MDL 压缩收益的支配。</w:t>
+        <w:t xml:space="preserve"> 掩蔽串联重复。参数依次表示 match reward、mismatch penalty、indel penalty、match probability、indel probability、minimum score 和 maximum period。预掩蔽降低微卫星、同聚体和简单重复对 MDL 压缩收益的支配。</w:t>
       </w:r>
     </w:p>
     <w:p>
@@ -7297,8 +6070,6 @@
       </w:r>
       <w:r>
         <w:tab/>
-      </w:r>
-      <w:r>
         <w:t xml:space="preserve">7.3 大基因组确定性采样</w:t>
       </w:r>
     </w:p>
@@ -7325,8 +6096,6 @@
       </w:r>
       <w:r>
         <w:tab/>
-      </w:r>
-      <w:r>
         <w:t xml:space="preserve">8. Refiner_mdl 家族精修</w:t>
       </w:r>
     </w:p>
@@ -7343,8 +6112,6 @@
       </w:r>
       <w:r>
         <w:tab/>
-      </w:r>
-      <w:r>
         <w:t xml:space="preserve">8.1 Phase 0：解析、硬过滤和分层</w:t>
       </w:r>
     </w:p>
@@ -7690,10 +6457,7 @@
         <w:pStyle w:val="BodyText"/>
       </w:pPr>
       <w:r>
-        <w:t xml:space="preserve">Shannon entropy 以</w:t>
-      </w:r>
-      <w:r>
-        <w:t xml:space="preserve"> </w:t>
+        <w:t xml:space="preserve">Shannon entropy 以 </w:t>
       </w:r>
       <m:oMath>
         <m:sSub>
@@ -7712,13 +6476,7 @@
           <m:rPr>
             <m:sty m:val="p"/>
           </m:rPr>
-          <m:t>=</m:t>
-        </m:r>
-        <m:r>
-          <m:rPr>
-            <m:sty m:val="p"/>
-          </m:rPr>
-          <m:t>−</m:t>
+          <m:t>=−</m:t>
         </m:r>
         <m:nary>
           <m:naryPr>
@@ -7781,10 +6539,7 @@
         </m:sSub>
       </m:oMath>
       <w:r>
-        <w:t xml:space="preserve"> </w:t>
-      </w:r>
-      <w:r>
-        <w:t xml:space="preserve">计算。k=1 最大为 2 bit；k=2 最大为 4 bit。长度低于 100 bp 的序列使用较低门槛，以容忍有限样本对 k-mer 频率估计的方差。</w:t>
+        <w:t xml:space="preserve"> 计算。k=1 最大为 2 bit；k=2 最大为 4 bit。长度低于 100 bp 的序列使用较低门槛，以容忍有限样本对 k-mer 频率估计的方差。</w:t>
       </w:r>
     </w:p>
     <w:p>
@@ -7798,10 +6553,7 @@
         <w:t xml:space="preserve">mdl_per_copy</w:t>
       </w:r>
       <w:r>
-        <w:t xml:space="preserve"> </w:t>
-      </w:r>
-      <w:r>
-        <w:t xml:space="preserve">的 P25/P75 将家族分为 T1/T2/T3。分层用于分配计算预算和输出用途，不表示 TE superfamily 分类。</w:t>
+        <w:t xml:space="preserve"> 的 P25/P75 将家族分为 T1/T2/T3。分层用于分配计算预算和输出用途，不表示 TE superfamily 分类。</w:t>
       </w:r>
     </w:p>
     <w:bookmarkEnd w:id="53"/>
@@ -7818,8 +6570,6 @@
       </w:r>
       <w:r>
         <w:tab/>
-      </w:r>
-      <w:r>
         <w:t xml:space="preserve">8.2 Phase 0 片段共现图与拼接</w:t>
       </w:r>
     </w:p>
@@ -7861,8 +6611,6 @@
       </w:r>
       <w:r>
         <w:tab/>
-      </w:r>
-      <w:r>
         <w:t xml:space="preserve">8.3 Phase 0.5 copy gate</w:t>
       </w:r>
     </w:p>
@@ -7880,10 +6628,7 @@
         <w:t xml:space="preserve">hard_min_copies</w:t>
       </w:r>
       <w:r>
-        <w:t xml:space="preserve"> </w:t>
-      </w:r>
-      <w:r>
-        <w:t xml:space="preserve">大于 0 时构成全家族 recurrence floor。结构信号只作为 rescue，不作为所有家族必须满足的条件。</w:t>
+        <w:t xml:space="preserve"> 大于 0 时构成全家族 recurrence floor。结构信号只作为 rescue，不作为所有家族必须满足的条件。</w:t>
       </w:r>
     </w:p>
     <w:bookmarkEnd w:id="55"/>
@@ -7900,8 +6645,6 @@
       </w:r>
       <w:r>
         <w:tab/>
-      </w:r>
-      <w:r>
         <w:t xml:space="preserve">8.4 Phase 1 实例提取和边界校正</w:t>
       </w:r>
     </w:p>
@@ -7923,37 +6666,13 @@
         </m:oMathParaPr>
         <m:oMath>
           <m:r>
-            <m:t>p</m:t>
-          </m:r>
-          <m:r>
-            <m:t>a</m:t>
-          </m:r>
-          <m:r>
-            <m:t>d</m:t>
-          </m:r>
-          <m:r>
-            <m:t>d</m:t>
-          </m:r>
-          <m:r>
-            <m:t>i</m:t>
-          </m:r>
-          <m:r>
-            <m:t>n</m:t>
-          </m:r>
-          <m:r>
-            <m:t>g</m:t>
+            <m:t>padding</m:t>
           </m:r>
           <m:r>
             <m:rPr>
               <m:sty m:val="p"/>
             </m:rPr>
-            <m:t>=</m:t>
-          </m:r>
-          <m:r>
-            <m:rPr>
-              <m:sty m:val="p"/>
-            </m:rPr>
-            <m:t>min</m:t>
+            <m:t>=min</m:t>
           </m:r>
           <m:d>
             <m:dPr>
@@ -7970,13 +6689,7 @@
                 <m:rPr>
                   <m:sty m:val="p"/>
                 </m:rPr>
-                <m:t>,</m:t>
-              </m:r>
-              <m:r>
-                <m:rPr>
-                  <m:sty m:val="p"/>
-                </m:rPr>
-                <m:t>max</m:t>
+                <m:t>,max</m:t>
               </m:r>
               <m:d>
                 <m:dPr>
@@ -8005,43 +6718,7 @@
                     <m:t>×</m:t>
                   </m:r>
                   <m:r>
-                    <m:t>f</m:t>
-                  </m:r>
-                  <m:r>
-                    <m:t>a</m:t>
-                  </m:r>
-                  <m:r>
-                    <m:t>m</m:t>
-                  </m:r>
-                  <m:r>
-                    <m:t>i</m:t>
-                  </m:r>
-                  <m:r>
-                    <m:t>l</m:t>
-                  </m:r>
-                  <m:r>
-                    <m:t>y</m:t>
-                  </m:r>
-                  <m:r>
-                    <m:t> </m:t>
-                  </m:r>
-                  <m:r>
-                    <m:t>l</m:t>
-                  </m:r>
-                  <m:r>
-                    <m:t>e</m:t>
-                  </m:r>
-                  <m:r>
-                    <m:t>n</m:t>
-                  </m:r>
-                  <m:r>
-                    <m:t>g</m:t>
-                  </m:r>
-                  <m:r>
-                    <m:t>t</m:t>
-                  </m:r>
-                  <m:r>
-                    <m:t>h</m:t>
+                    <m:t>family length</m:t>
                   </m:r>
                 </m:e>
               </m:d>
@@ -8063,10 +6740,7 @@
         <w:pStyle w:val="BodyText"/>
       </w:pPr>
       <w:r>
-        <w:t xml:space="preserve">MSA 引擎根据 copy 数、分化和总 bp 选择。低分化小家族可使用 MAFFT L-INS-i；常规家族使用 MAFFT auto；copy 数或总 MSA bp 较大时使用 abPOA。单序列超过 50 kb、总输入超过 8 Mb 或每次 MSA 超过 60 s 时不生成推测性共识，而是保留原 seed。subfamily consensus length 大于 2,500 bp 或</w:t>
-      </w:r>
-      <w:r>
-        <w:t xml:space="preserve"> </w:t>
+        <w:t xml:space="preserve">MSA 引擎根据 copy 数、分化和总 bp 选择。低分化小家族可使用 MAFFT L-INS-i；常规家族使用 MAFFT auto；copy 数或总 MSA bp 较大时使用 abPOA。单序列超过 50 kb、总输入超过 8 Mb 或每次 MSA 超过 60 s 时不生成推测性共识，而是保留原 seed。subfamily consensus length 大于 2,500 bp 或 </w:t>
       </w:r>
       <w:r>
         <w:rPr>
@@ -8075,10 +6749,7 @@
         <w:t xml:space="preserve">copy_count × consensus_length</w:t>
       </w:r>
       <w:r>
-        <w:t xml:space="preserve"> </w:t>
-      </w:r>
-      <w:r>
-        <w:t xml:space="preserve">超过 500,000 时不进入昂贵的 subfamily MSA。</w:t>
+        <w:t xml:space="preserve"> 超过 500,000 时不进入昂贵的 subfamily MSA。</w:t>
       </w:r>
     </w:p>
     <w:p>
@@ -8103,8 +6774,6 @@
       </w:r>
       <w:r>
         <w:tab/>
-      </w:r>
-      <w:r>
         <w:t xml:space="preserve">8.5 嵌合与亚家族</w:t>
       </w:r>
     </w:p>
@@ -8138,8 +6807,6 @@
       </w:r>
       <w:r>
         <w:tab/>
-      </w:r>
-      <w:r>
         <w:t xml:space="preserve">8.6 Phase 2 质量控制和双库输出</w:t>
       </w:r>
     </w:p>
@@ -8156,10 +6823,7 @@
         <w:pStyle w:val="BodyText"/>
       </w:pPr>
       <w:r>
-        <w:t xml:space="preserve">TE protein、LTR/TIR 和已知 TE homology 默认作为注释，不作为普遍硬删除条件。MDL quality gate 保留满足任一条件的家族：tier 为</w:t>
-      </w:r>
-      <w:r>
-        <w:t xml:space="preserve"> </w:t>
+        <w:t xml:space="preserve">TE protein、LTR/TIR 和已知 TE homology 默认作为注释，不作为普遍硬删除条件。MDL quality gate 保留满足任一条件的家族：tier 为 </w:t>
       </w:r>
       <w:r>
         <w:rPr>
@@ -8176,10 +6840,7 @@
         <w:pStyle w:val="BodyText"/>
       </w:pPr>
       <w:r>
-        <w:t xml:space="preserve">masking library 使用长度依赖 copy floor：长度至少 500 bp 需 2 copies；200–499 bp 需 3；100–199 bp 需 5；低于 100 bp 需 10。analysis library 包含 masking library，并加入 copies 至少 3 的 T3。输出分别为</w:t>
-      </w:r>
-      <w:r>
-        <w:t xml:space="preserve"> </w:t>
+        <w:t xml:space="preserve">masking library 使用长度依赖 copy floor：长度至少 500 bp 需 2 copies；200–499 bp 需 3；100–199 bp 需 5；低于 100 bp 需 10。analysis library 包含 masking library，并加入 copies 至少 3 的 T3。输出分别为 </w:t>
       </w:r>
       <w:r>
         <w:rPr>
@@ -8188,13 +6849,7 @@
         <w:t xml:space="preserve">consensus_masking.fa</w:t>
       </w:r>
       <w:r>
-        <w:t xml:space="preserve"> </w:t>
-      </w:r>
-      <w:r>
-        <w:t xml:space="preserve">和</w:t>
-      </w:r>
-      <w:r>
-        <w:t xml:space="preserve"> </w:t>
+        <w:t xml:space="preserve"> 和 </w:t>
       </w:r>
       <w:r>
         <w:rPr>
@@ -8221,8 +6876,6 @@
       </w:r>
       <w:r>
         <w:tab/>
-      </w:r>
-      <w:r>
         <w:t xml:space="preserve">9. TE-looker 生产轨道</w:t>
       </w:r>
     </w:p>
@@ -8239,8 +6892,6 @@
       </w:r>
       <w:r>
         <w:tab/>
-      </w:r>
-      <w:r>
         <w:t xml:space="preserve">9.1 capability probe 与自适应 seed floor</w:t>
       </w:r>
     </w:p>
@@ -8249,10 +6900,7 @@
         <w:pStyle w:val="FirstParagraph"/>
       </w:pPr>
       <w:r>
-        <w:t xml:space="preserve">Pan_TE 从</w:t>
-      </w:r>
-      <w:r>
-        <w:t xml:space="preserve"> </w:t>
+        <w:t xml:space="preserve">Pan_TE 从 </w:t>
       </w:r>
       <w:r>
         <w:rPr>
@@ -8270,10 +6918,7 @@
         <w:t xml:space="preserve">TE_LOOKER_BIN</w:t>
       </w:r>
       <w:r>
-        <w:t xml:space="preserve">、PATH 和仓库</w:t>
-      </w:r>
-      <w:r>
-        <w:t xml:space="preserve"> </w:t>
+        <w:t xml:space="preserve">、PATH 和仓库 </w:t>
       </w:r>
       <w:r>
         <w:rPr>
@@ -8282,13 +6927,7 @@
         <w:t xml:space="preserve">bin/dtr</w:t>
       </w:r>
       <w:r>
-        <w:t xml:space="preserve"> </w:t>
-      </w:r>
-      <w:r>
-        <w:t xml:space="preserve">解析可执行文件，并查询</w:t>
-      </w:r>
-      <w:r>
-        <w:t xml:space="preserve"> </w:t>
+        <w:t xml:space="preserve"> 解析可执行文件，并查询 </w:t>
       </w:r>
       <w:r>
         <w:rPr>
@@ -8297,13 +6936,7 @@
         <w:t xml:space="preserve">--version</w:t>
       </w:r>
       <w:r>
-        <w:t xml:space="preserve"> </w:t>
-      </w:r>
-      <w:r>
-        <w:t xml:space="preserve">与</w:t>
-      </w:r>
-      <w:r>
-        <w:t xml:space="preserve"> </w:t>
+        <w:t xml:space="preserve"> 与 </w:t>
       </w:r>
       <w:r>
         <w:rPr>
@@ -8321,10 +6954,7 @@
         <w:t xml:space="preserve">--final-gated</w:t>
       </w:r>
       <w:r>
-        <w:t xml:space="preserve"> </w:t>
-      </w:r>
-      <w:r>
-        <w:t xml:space="preserve">是否为显式能力以及 provenance 的接纳方式。</w:t>
+        <w:t xml:space="preserve"> 是否为显式能力以及 provenance 的接纳方式。</w:t>
       </w:r>
     </w:p>
     <w:p>
@@ -8332,10 +6962,7 @@
         <w:pStyle w:val="BodyText"/>
       </w:pPr>
       <w:r>
-        <w:t xml:space="preserve">canonical 16-mer 的基础</w:t>
-      </w:r>
-      <w:r>
-        <w:t xml:space="preserve"> </w:t>
+        <w:t xml:space="preserve">canonical 16-mer 的基础 </w:t>
       </w:r>
       <w:r>
         <w:rPr>
@@ -8344,13 +6971,7 @@
         <w:t xml:space="preserve">--min-count</w:t>
       </w:r>
       <w:r>
-        <w:t xml:space="preserve"> </w:t>
-      </w:r>
-      <w:r>
-        <w:t xml:space="preserve">随基因组大小取值：小于 300 Mb 为 50；300 Mb–1 Gb 为 100；1–3 Gb 为 200；3–10 Gb 为 300；大于 10 Gb 为 500。若用户显式使用</w:t>
-      </w:r>
-      <w:r>
-        <w:t xml:space="preserve"> </w:t>
+        <w:t xml:space="preserve"> 随基因组大小取值：小于 300 Mb 为 50；300 Mb–1 Gb 为 100；1–3 Gb 为 200；3–10 Gb 为 300；大于 10 Gb 为 500。若用户显式使用 </w:t>
       </w:r>
       <m:oMath>
         <m:r>
@@ -8399,13 +7020,7 @@
             <m:rPr>
               <m:sty m:val="p"/>
             </m:rPr>
-            <m:t>=</m:t>
-          </m:r>
-          <m:r>
-            <m:rPr>
-              <m:sty m:val="p"/>
-            </m:rPr>
-            <m:t>max</m:t>
+            <m:t>=max</m:t>
           </m:r>
           <m:d>
             <m:dPr>
@@ -8422,13 +7037,7 @@
                 <m:rPr>
                   <m:sty m:val="p"/>
                 </m:rPr>
-                <m:t>,</m:t>
-              </m:r>
-              <m:r>
-                <m:rPr>
-                  <m:sty m:val="p"/>
-                </m:rPr>
-                <m:t>round</m:t>
+                <m:t>,round</m:t>
               </m:r>
               <m:d>
                 <m:dPr>
@@ -8491,10 +7100,7 @@
         <w:t xml:space="preserve">RUST_MIN_STACK</w:t>
       </w:r>
       <w:r>
-        <w:t xml:space="preserve"> </w:t>
-      </w:r>
-      <w:r>
-        <w:t xml:space="preserve">设为 64 MiB，降低并行 seed harvest 的线程栈溢出风险。</w:t>
+        <w:t xml:space="preserve"> 设为 64 MiB，降低并行 seed harvest 的线程栈溢出风险。</w:t>
       </w:r>
     </w:p>
     <w:bookmarkEnd w:id="60"/>
@@ -8511,8 +7117,6 @@
       </w:r>
       <w:r>
         <w:tab/>
-      </w:r>
-      <w:r>
         <w:t xml:space="preserve">9.2 HMM 种子</w:t>
       </w:r>
     </w:p>
@@ -8521,10 +7125,7 @@
         <w:pStyle w:val="FirstParagraph"/>
       </w:pPr>
       <w:r>
-        <w:t xml:space="preserve">Refiner_mdl 的 masking consensus 可通过 MAFFT 对齐和</w:t>
-      </w:r>
-      <w:r>
-        <w:t xml:space="preserve"> </w:t>
+        <w:t xml:space="preserve">Refiner_mdl 的 masking consensus 可通过 MAFFT 对齐和 </w:t>
       </w:r>
       <w:r>
         <w:rPr>
@@ -8533,10 +7134,7 @@
         <w:t xml:space="preserve">hmmbuild</w:t>
       </w:r>
       <w:r>
-        <w:t xml:space="preserve"> </w:t>
-      </w:r>
-      <w:r>
-        <w:t xml:space="preserve">构建 nucleotide HMM。该 HMM 作为已知/高置信家族的 profile 证据输入 TE-looker Track 1。HMM 构建失败不生成伪模型；TE-looker 仍可使用 de novo discovery 轨道。</w:t>
+        <w:t xml:space="preserve"> 构建 nucleotide HMM。该 HMM 作为已知/高置信家族的 profile 证据输入 TE-looker Track 1。HMM 构建失败不生成伪模型；TE-looker 仍可使用 de novo discovery 轨道。</w:t>
       </w:r>
     </w:p>
     <w:bookmarkEnd w:id="61"/>
@@ -8553,8 +7151,6 @@
       </w:r>
       <w:r>
         <w:tab/>
-      </w:r>
-      <w:r>
         <w:t xml:space="preserve">9.3 gated contract 和宿主门控</w:t>
       </w:r>
     </w:p>
@@ -8563,10 +7159,7 @@
         <w:pStyle w:val="FirstParagraph"/>
       </w:pPr>
       <w:r>
-        <w:t xml:space="preserve">满足</w:t>
-      </w:r>
-      <w:r>
-        <w:t xml:space="preserve"> </w:t>
+        <w:t xml:space="preserve">满足 </w:t>
       </w:r>
       <w:r>
         <w:rPr>
@@ -8575,13 +7168,7 @@
         <w:t xml:space="preserve">te-looker-gated-v1</w:t>
       </w:r>
       <w:r>
-        <w:t xml:space="preserve"> </w:t>
-      </w:r>
-      <w:r>
-        <w:t xml:space="preserve">的 dtr provenance 表示</w:t>
-      </w:r>
-      <w:r>
-        <w:t xml:space="preserve"> </w:t>
+        <w:t xml:space="preserve"> 的 dtr provenance 表示 </w:t>
       </w:r>
       <w:r>
         <w:rPr>
@@ -8590,10 +7177,7 @@
         <w:t xml:space="preserve">families.fasta</w:t>
       </w:r>
       <w:r>
-        <w:t xml:space="preserve"> </w:t>
-      </w:r>
-      <w:r>
-        <w:t xml:space="preserve">包含 fragment stitch、copy/length gate 和跨 seed merge 的门控结果，Pan_TE 对文件和契约作一致性验证后使用该库。</w:t>
+        <w:t xml:space="preserve"> 包含 fragment stitch、copy/length gate 和跨 seed merge 的门控结果，Pan_TE 对文件和契约作一致性验证后使用该库。</w:t>
       </w:r>
     </w:p>
     <w:p>
@@ -8613,10 +7197,7 @@
         </w:numPr>
       </w:pPr>
       <w:r>
-        <w:t xml:space="preserve">使用</w:t>
-      </w:r>
-      <w:r>
-        <w:t xml:space="preserve"> </w:t>
+        <w:t xml:space="preserve">使用 </w:t>
       </w:r>
       <w:r>
         <w:rPr>
@@ -8625,10 +7206,7 @@
         <w:t xml:space="preserve">disc.members.bed</w:t>
       </w:r>
       <w:r>
-        <w:t xml:space="preserve"> </w:t>
-      </w:r>
-      <w:r>
-        <w:t xml:space="preserve">统计不同 fragment family 在多个实例中的共线邻接，重提取支持链并建立 stitched consensus；拼接无可信证据时保留原 family。</w:t>
+        <w:t xml:space="preserve"> 统计不同 fragment family 在多个实例中的共线邻接，重提取支持链并建立 stitched consensus；拼接无可信证据时保留原 family。</w:t>
       </w:r>
     </w:p>
     <w:p>
@@ -8640,10 +7218,7 @@
         </w:numPr>
       </w:pPr>
       <w:r>
-        <w:t xml:space="preserve">从 header 读取</w:t>
-      </w:r>
-      <w:r>
-        <w:t xml:space="preserve"> </w:t>
+        <w:t xml:space="preserve">从 header 读取 </w:t>
       </w:r>
       <w:r>
         <w:rPr>
@@ -8664,10 +7239,7 @@
         </w:numPr>
       </w:pPr>
       <w:r>
-        <w:t xml:space="preserve">使用</w:t>
-      </w:r>
-      <w:r>
-        <w:t xml:space="preserve"> </w:t>
+        <w:t xml:space="preserve">使用 </w:t>
       </w:r>
       <w:r>
         <w:rPr>
@@ -8676,10 +7248,7 @@
         <w:t xml:space="preserve">cd-hit-est -c 0.80 -aS 0.60 -n 5 -r 1 -g 1</w:t>
       </w:r>
       <w:r>
-        <w:t xml:space="preserve"> </w:t>
-      </w:r>
-      <w:r>
-        <w:t xml:space="preserve">合并跨 seed 的部分重叠 family。</w:t>
+        <w:t xml:space="preserve"> 合并跨 seed 的部分重叠 family。</w:t>
       </w:r>
     </w:p>
     <w:p>
@@ -8691,10 +7260,7 @@
         </w:numPr>
       </w:pPr>
       <w:r>
-        <w:t xml:space="preserve">最终 family 数不得超过</w:t>
-      </w:r>
-      <w:r>
-        <w:t xml:space="preserve"> </w:t>
+        <w:t xml:space="preserve">最终 family 数不得超过 </w:t>
       </w:r>
       <w:r>
         <w:rPr>
@@ -8717,10 +7283,7 @@
         <w:t xml:space="preserve">pan_te_handoff.json</w:t>
       </w:r>
       <w:r>
-        <w:t xml:space="preserve"> </w:t>
-      </w:r>
-      <w:r>
-        <w:t xml:space="preserve">记录输入、发现库、拼接库、门控库和最终轨道库的 SHA-256、序列数、总 bp、阈值和拼接状态。</w:t>
+        <w:t xml:space="preserve"> 记录输入、发现库、拼接库、门控库和最终轨道库的 SHA-256、序列数、总 bp、阈值和拼接状态。</w:t>
       </w:r>
     </w:p>
     <w:bookmarkEnd w:id="62"/>
@@ -8737,8 +7300,6 @@
       </w:r>
       <w:r>
         <w:tab/>
-      </w:r>
-      <w:r>
         <w:t xml:space="preserve">9.4 嵌套实例分解与自适应边界重估</w:t>
       </w:r>
     </w:p>
@@ -8756,10 +7317,7 @@
         <w:t xml:space="preserve">dtr-copy</w:t>
       </w:r>
       <w:r>
-        <w:t xml:space="preserve"> </w:t>
-      </w:r>
-      <w:r>
-        <w:t xml:space="preserve">首先生成全基因组 copy BED。</w:t>
+        <w:t xml:space="preserve"> 首先生成全基因组 copy BED。</w:t>
       </w:r>
       <w:r>
         <w:rPr>
@@ -8768,10 +7326,7 @@
         <w:t xml:space="preserve">dtr-nested --min-flank 80</w:t>
       </w:r>
       <w:r>
-        <w:t xml:space="preserve"> </w:t>
-      </w:r>
-      <w:r>
-        <w:t xml:space="preserve">在同 chromosome 上识别一个 family 的 inner instance 被另一 family 的 outer instance 完整包含、且 outer 两侧各保留至少 80 bp 的事件。含 inner 的 outer instance 不参与 outer family 边界估计；inner family 仍由自身 copy 表示。</w:t>
+        <w:t xml:space="preserve"> 在同 chromosome 上识别一个 family 的 inner instance 被另一 family 的 outer instance 完整包含、且 outer 两侧各保留至少 80 bp 的事件。含 inner 的 outer instance 不参与 outer family 边界估计；inner family 仍由自身 copy 表示。</w:t>
       </w:r>
     </w:p>
     <w:p>
@@ -8785,13 +7340,7 @@
         <w:t xml:space="preserve">dtr-boundary</w:t>
       </w:r>
       <w:r>
-        <w:t xml:space="preserve"> </w:t>
-      </w:r>
-      <w:r>
-        <w:t xml:space="preserve">从 clean instances 提取默认 100 bp flanks，统一方向后以 POA 生成 proposal。family 至少需要 5 个成员；proposal length 必须位于原长度的</w:t>
-      </w:r>
-      <w:r>
-        <w:t xml:space="preserve"> </w:t>
+        <w:t xml:space="preserve"> 从 clean instances 提取默认 100 bp flanks，统一方向后以 POA 生成 proposal。family 至少需要 5 个成员；proposal length 必须位于原长度的 </w:t>
       </w:r>
       <m:oMath>
         <m:d>
@@ -8827,10 +7376,7 @@
         </m:d>
       </m:oMath>
       <w:r>
-        <w:t xml:space="preserve"> </w:t>
-      </w:r>
-      <w:r>
-        <w:t xml:space="preserve">倍范围；单 family POA 输入默认最多 4,000 bp。预算不足或证据不足时原 consensus 原样保留。</w:t>
+        <w:t xml:space="preserve"> 倍范围；单 family POA 输入默认最多 4,000 bp。预算不足或证据不足时原 consensus 原样保留。</w:t>
       </w:r>
     </w:p>
     <w:p>
@@ -8838,10 +7384,7 @@
         <w:pStyle w:val="BodyText"/>
       </w:pPr>
       <w:r>
-        <w:t xml:space="preserve">proposal library 重新运行</w:t>
-      </w:r>
-      <w:r>
-        <w:t xml:space="preserve"> </w:t>
+        <w:t xml:space="preserve">proposal library 重新运行 </w:t>
       </w:r>
       <w:r>
         <w:rPr>
@@ -8859,10 +7402,7 @@
         <w:t xml:space="preserve">dtr-boundary-gate</w:t>
       </w:r>
       <w:r>
-        <w:t xml:space="preserve"> </w:t>
-      </w:r>
-      <w:r>
-        <w:t xml:space="preserve">对每个 family/chromosome 的实例区间求并集，只有 proposal coverage 相对原库增加至少 1% 且序列发生改变时采用 proposal，其余 family 回退到原 consensus。coverage 是边界 proposal 的选择代理，最终库效果由匹配参数的独立 RepeatMasker 验证。</w:t>
+        <w:t xml:space="preserve"> 对每个 family/chromosome 的实例区间求并集，只有 proposal coverage 相对原库增加至少 1% 且序列发生改变时采用 proposal，其余 family 回退到原 consensus。coverage 是边界 proposal 的选择代理，最终库效果由匹配参数的独立 RepeatMasker 验证。</w:t>
       </w:r>
     </w:p>
     <w:bookmarkEnd w:id="63"/>
@@ -8879,8 +7419,6 @@
       </w:r>
       <w:r>
         <w:tab/>
-      </w:r>
-      <w:r>
         <w:t xml:space="preserve">9.5 Track 2 部分证据链的当前输出语义</w:t>
       </w:r>
     </w:p>
@@ -8895,13 +7433,7 @@
         <w:t xml:space="preserve">dtr-window</w:t>
       </w:r>
       <w:r>
-        <w:t xml:space="preserve"> </w:t>
-      </w:r>
-      <w:r>
-        <w:t xml:space="preserve">从重复 canonical spaced seed occurrence 中按全局 hash-bottom 选择候选窗口；默认 seed pattern 为</w:t>
-      </w:r>
-      <w:r>
-        <w:t xml:space="preserve"> </w:t>
+        <w:t xml:space="preserve"> 从重复 canonical spaced seed occurrence 中按全局 hash-bottom 选择候选窗口；默认 seed pattern 为 </w:t>
       </w:r>
       <w:r>
         <w:rPr>
@@ -8919,10 +7451,7 @@
         <w:t xml:space="preserve">dtr-lsh</w:t>
       </w:r>
       <w:r>
-        <w:t xml:space="preserve"> </w:t>
-      </w:r>
-      <w:r>
-        <w:t xml:space="preserve">对窗口计算 canonical 15-mer bottom-k MinHash（128 hashes），按 band 生成候选对，每个 bucket 最多 128 个节点，精确 Jaccard 至少 0.08，每节点最多保留 16 条边。</w:t>
+        <w:t xml:space="preserve"> 对窗口计算 canonical 15-mer bottom-k MinHash（128 hashes），按 band 生成候选对，每个 bucket 最多 128 个节点，精确 Jaccard 至少 0.08，每节点最多保留 16 条边。</w:t>
       </w:r>
     </w:p>
     <w:p>
@@ -8936,10 +7465,7 @@
         <w:t xml:space="preserve">dtr-community</w:t>
       </w:r>
       <w:r>
-        <w:t xml:space="preserve"> </w:t>
-      </w:r>
-      <w:r>
-        <w:t xml:space="preserve">输出连通分量容器，</w:t>
+        <w:t xml:space="preserve"> 输出连通分量容器，</w:t>
       </w:r>
       <w:r>
         <w:rPr>
@@ -8948,10 +7474,7 @@
         <w:t xml:space="preserve">dtr-community-refine</w:t>
       </w:r>
       <w:r>
-        <w:t xml:space="preserve"> </w:t>
-      </w:r>
-      <w:r>
-        <w:t xml:space="preserve">执行确定性 first-level Louvain local moving。该社区结果不是 Leiden 多层优化，也不直接构成 TE family。</w:t>
+        <w:t xml:space="preserve"> 执行确定性 first-level Louvain local moving。该社区结果不是 Leiden 多层优化，也不直接构成 TE family。</w:t>
       </w:r>
       <w:r>
         <w:rPr>
@@ -8960,10 +7483,7 @@
         <w:t xml:space="preserve">dtr-component-poa</w:t>
       </w:r>
       <w:r>
-        <w:t xml:space="preserve"> </w:t>
-      </w:r>
-      <w:r>
-        <w:t xml:space="preserve">只对成员数满足门槛的社区生成 provisional consensus。</w:t>
+        <w:t xml:space="preserve"> 只对成员数满足门槛的社区生成 provisional consensus。</w:t>
       </w:r>
     </w:p>
     <w:p>
@@ -8977,10 +7497,7 @@
         <w:t xml:space="preserve">dtr-copy</w:t>
       </w:r>
       <w:r>
-        <w:t xml:space="preserve"> </w:t>
-      </w:r>
-      <w:r>
-        <w:t xml:space="preserve">使用 BLASTN 建 copy catalog：HSP 按 query/chromosome/strand 分组，query gap 至多 200 bp、genome gap 至多 500 bp 时合并；合并实例要求 query coverage 至少 0.60、identity 至少 75%；同 query/chromosome/strand 上起点相距不超过 100 bp 的冗余实例只保留一个。</w:t>
+        <w:t xml:space="preserve"> 使用 BLASTN 建 copy catalog：HSP 按 query/chromosome/strand 分组，query gap 至多 200 bp、genome gap 至多 500 bp 时合并；合并实例要求 query coverage 至少 0.60、identity 至少 75%；同 query/chromosome/strand 上起点相距不超过 100 bp 的冗余实例只保留一个。</w:t>
       </w:r>
     </w:p>
     <w:p>
@@ -8994,10 +7511,7 @@
         <w:t xml:space="preserve">dtr-nonte-guard</w:t>
       </w:r>
       <w:r>
-        <w:t xml:space="preserve"> </w:t>
-      </w:r>
-      <w:r>
-        <w:t xml:space="preserve">使用用户明确提供的 non-TE reference。identity 至少 80% 的 HSP 在 query 坐标上求并集；high-identity query coverage 至少 0.80 时，候选被解释为 non-TE。</w:t>
+        <w:t xml:space="preserve"> 使用用户明确提供的 non-TE reference。identity 至少 80% 的 HSP 在 query 坐标上求并集；high-identity query coverage 至少 0.80 时，候选被解释为 non-TE。</w:t>
       </w:r>
       <w:r>
         <w:rPr>
@@ -9006,10 +7520,7 @@
         <w:t xml:space="preserve">dtr-structure</w:t>
       </w:r>
       <w:r>
-        <w:t xml:space="preserve"> </w:t>
-      </w:r>
-      <w:r>
-        <w:t xml:space="preserve">审计 copy flanks 中 3–15 bp TSD、至少 12 bp terminal direct/inverted seed 和 terminal poly-A/T；少于 20 copies 时标记 boundary uncertain。</w:t>
+        <w:t xml:space="preserve"> 审计 copy flanks 中 3–15 bp TSD、至少 12 bp terminal direct/inverted seed 和 terminal poly-A/T；少于 20 copies 时标记 boundary uncertain。</w:t>
       </w:r>
     </w:p>
     <w:p>
@@ -9023,13 +7534,7 @@
         <w:t xml:space="preserve">dtr-accept-audit</w:t>
       </w:r>
       <w:r>
-        <w:t xml:space="preserve"> </w:t>
-      </w:r>
-      <w:r>
-        <w:t xml:space="preserve">分列报告 copy、structure、boundary、non-TE、segmental-duplication 和外部守卫状态。Track 2 provenance 固定</w:t>
-      </w:r>
-      <w:r>
-        <w:t xml:space="preserve"> </w:t>
+        <w:t xml:space="preserve"> 分列报告 copy、structure、boundary、non-TE、segmental-duplication 和外部守卫状态。Track 2 provenance 固定 </w:t>
       </w:r>
       <w:r>
         <w:rPr>
@@ -9083,8 +7588,6 @@
       </w:r>
       <w:r>
         <w:tab/>
-      </w:r>
-      <w:r>
         <w:t xml:space="preserve">10. 三轨合并、去冗余与可选分类</w:t>
       </w:r>
     </w:p>
@@ -9093,10 +7596,7 @@
         <w:pStyle w:val="FirstParagraph"/>
       </w:pPr>
       <w:r>
-        <w:t xml:space="preserve">合并输入为 Look4LTRs</w:t>
-      </w:r>
-      <w:r>
-        <w:t xml:space="preserve"> </w:t>
+        <w:t xml:space="preserve">合并输入为 Look4LTRs </w:t>
       </w:r>
       <w:r>
         <w:rPr>
@@ -9105,10 +7605,7 @@
         <w:t xml:space="preserve">ltr_library.fa</w:t>
       </w:r>
       <w:r>
-        <w:t xml:space="preserve">、Refiner_mdl</w:t>
-      </w:r>
-      <w:r>
-        <w:t xml:space="preserve"> </w:t>
+        <w:t xml:space="preserve">、Refiner_mdl </w:t>
       </w:r>
       <w:r>
         <w:rPr>
@@ -9117,13 +7614,7 @@
         <w:t xml:space="preserve">phase3_analysis_library.fa</w:t>
       </w:r>
       <w:r>
-        <w:t xml:space="preserve"> </w:t>
-      </w:r>
-      <w:r>
-        <w:t xml:space="preserve">和 TE-looker</w:t>
-      </w:r>
-      <w:r>
-        <w:t xml:space="preserve"> </w:t>
+        <w:t xml:space="preserve"> 和 TE-looker </w:t>
       </w:r>
       <w:r>
         <w:rPr>
@@ -9132,10 +7623,7 @@
         <w:t xml:space="preserve">consensus.fa</w:t>
       </w:r>
       <w:r>
-        <w:t xml:space="preserve">。三者直接串接为</w:t>
-      </w:r>
-      <w:r>
-        <w:t xml:space="preserve"> </w:t>
+        <w:t xml:space="preserve">。三者直接串接为 </w:t>
       </w:r>
       <w:r>
         <w:rPr>
@@ -9169,10 +7657,7 @@
         <w:t xml:space="preserve">-c 0.90</w:t>
       </w:r>
       <w:r>
-        <w:t xml:space="preserve"> </w:t>
-      </w:r>
-      <w:r>
-        <w:t xml:space="preserve">要求高序列 identity；</w:t>
+        <w:t xml:space="preserve"> 要求高序列 identity；</w:t>
       </w:r>
       <w:r>
         <w:rPr>
@@ -9181,10 +7666,7 @@
         <w:t xml:space="preserve">-aS/-aL 0.80</w:t>
       </w:r>
       <w:r>
-        <w:t xml:space="preserve"> </w:t>
-      </w:r>
-      <w:r>
-        <w:t xml:space="preserve">要求两条序列均有充分覆盖；</w:t>
+        <w:t xml:space="preserve"> 要求两条序列均有充分覆盖；</w:t>
       </w:r>
       <w:r>
         <w:rPr>
@@ -9193,10 +7675,7 @@
         <w:t xml:space="preserve">-G 0</w:t>
       </w:r>
       <w:r>
-        <w:t xml:space="preserve"> </w:t>
-      </w:r>
-      <w:r>
-        <w:t xml:space="preserve">使用局部 identity 定义；</w:t>
+        <w:t xml:space="preserve"> 使用局部 identity 定义；</w:t>
       </w:r>
       <w:r>
         <w:rPr>
@@ -9205,10 +7684,7 @@
         <w:t xml:space="preserve">-r 1</w:t>
       </w:r>
       <w:r>
-        <w:t xml:space="preserve"> </w:t>
-      </w:r>
-      <w:r>
-        <w:t xml:space="preserve">同时考虑反向互补。跨轨阈值高于 TE-looker 轨道内 0.80，是因为跨轨合并只消除近重复，不把相关但独立的家族合并。</w:t>
+        <w:t xml:space="preserve"> 同时考虑反向互补。跨轨阈值高于 TE-looker 轨道内 0.80，是因为跨轨合并只消除近重复，不把相关但独立的家族合并。</w:t>
       </w:r>
     </w:p>
     <w:p>
@@ -9216,10 +7692,7 @@
         <w:pStyle w:val="BodyText"/>
       </w:pPr>
       <w:r>
-        <w:t xml:space="preserve">去冗余未分类库为</w:t>
-      </w:r>
-      <w:r>
-        <w:t xml:space="preserve"> </w:t>
+        <w:t xml:space="preserve">去冗余未分类库为 </w:t>
       </w:r>
       <w:r>
         <w:rPr>
@@ -9228,10 +7701,7 @@
         <w:t xml:space="preserve">combine/raw_te_library.fa</w:t>
       </w:r>
       <w:r>
-        <w:t xml:space="preserve">。提供</w:t>
-      </w:r>
-      <w:r>
-        <w:t xml:space="preserve"> </w:t>
+        <w:t xml:space="preserve">。提供 </w:t>
       </w:r>
       <w:r>
         <w:rPr>
@@ -9240,13 +7710,7 @@
         <w:t xml:space="preserve">--model-dir</w:t>
       </w:r>
       <w:r>
-        <w:t xml:space="preserve"> </w:t>
-      </w:r>
-      <w:r>
-        <w:t xml:space="preserve">时，RepeatClassifier 与 ClassifyTE 在隔离环境中运行，并由</w:t>
-      </w:r>
-      <w:r>
-        <w:t xml:space="preserve"> </w:t>
+        <w:t xml:space="preserve"> 时，RepeatClassifier 与 ClassifyTE 在隔离环境中运行，并由 </w:t>
       </w:r>
       <w:r>
         <w:rPr>
@@ -9255,13 +7719,7 @@
         <w:t xml:space="preserve">Combine_for_Two</w:t>
       </w:r>
       <w:r>
-        <w:t xml:space="preserve"> </w:t>
-      </w:r>
-      <w:r>
-        <w:t xml:space="preserve">合并标签，输出</w:t>
-      </w:r>
-      <w:r>
-        <w:t xml:space="preserve"> </w:t>
+        <w:t xml:space="preserve"> 合并标签，输出 </w:t>
       </w:r>
       <w:r>
         <w:rPr>
@@ -9287,8 +7745,6 @@
       </w:r>
       <w:r>
         <w:tab/>
-      </w:r>
-      <w:r>
         <w:t xml:space="preserve">11. 参数选择原则与敏感性</w:t>
       </w:r>
     </w:p>
@@ -10049,8 +8505,6 @@
       </w:r>
       <w:r>
         <w:tab/>
-      </w:r>
-      <w:r>
         <w:t xml:space="preserve">12. 质量控制、溯源与复现</w:t>
       </w:r>
     </w:p>
@@ -10067,8 +8521,6 @@
       </w:r>
       <w:r>
         <w:tab/>
-      </w:r>
-      <w:r>
         <w:t xml:space="preserve">12.1 必需审计</w:t>
       </w:r>
     </w:p>
@@ -10102,8 +8554,6 @@
       </w:r>
       <w:r>
         <w:tab/>
-      </w:r>
-      <w:r>
         <w:t xml:space="preserve">12.2 GFA 注释验证</w:t>
       </w:r>
     </w:p>
@@ -10112,10 +8562,7 @@
         <w:pStyle w:val="FirstParagraph"/>
       </w:pPr>
       <w:r>
-        <w:t xml:space="preserve">投影验证应在 genome-coordinate 层完成。对每个</w:t>
-      </w:r>
-      <w:r>
-        <w:t xml:space="preserve"> </w:t>
+        <w:t xml:space="preserve">投影验证应在 genome-coordinate 层完成。对每个 </w:t>
       </w:r>
       <w:r>
         <w:rPr>
@@ -10154,49 +8601,7 @@
             </m:dPr>
             <m:e>
               <m:r>
-                <m:t>s</m:t>
-              </m:r>
-              <m:r>
-                <m:t>o</m:t>
-              </m:r>
-              <m:r>
-                <m:t>u</m:t>
-              </m:r>
-              <m:r>
-                <m:t>r</m:t>
-              </m:r>
-              <m:r>
-                <m:t>c</m:t>
-              </m:r>
-              <m:r>
-                <m:t>e</m:t>
-              </m:r>
-              <m:r>
-                <m:t> </m:t>
-              </m:r>
-              <m:r>
-                <m:t>T</m:t>
-              </m:r>
-              <m:r>
-                <m:t>E</m:t>
-              </m:r>
-              <m:r>
-                <m:t> </m:t>
-              </m:r>
-              <m:r>
-                <m:t>u</m:t>
-              </m:r>
-              <m:r>
-                <m:t>n</m:t>
-              </m:r>
-              <m:r>
-                <m:t>i</m:t>
-              </m:r>
-              <m:r>
-                <m:t>o</m:t>
-              </m:r>
-              <m:r>
-                <m:t>n</m:t>
+                <m:t>source TE union</m:t>
               </m:r>
             </m:e>
           </m:d>
@@ -10215,46 +8620,7 @@
             </m:dPr>
             <m:e>
               <m:r>
-                <m:t>c</m:t>
-              </m:r>
-              <m:r>
-                <m:t>a</m:t>
-              </m:r>
-              <m:r>
-                <m:t>l</m:t>
-              </m:r>
-              <m:r>
-                <m:t>l</m:t>
-              </m:r>
-              <m:r>
-                <m:t>a</m:t>
-              </m:r>
-              <m:r>
-                <m:t>b</m:t>
-              </m:r>
-              <m:r>
-                <m:t>l</m:t>
-              </m:r>
-              <m:r>
-                <m:t>e</m:t>
-              </m:r>
-              <m:r>
-                <m:t> </m:t>
-              </m:r>
-              <m:r>
-                <m:t>u</m:t>
-              </m:r>
-              <m:r>
-                <m:t>n</m:t>
-              </m:r>
-              <m:r>
-                <m:t>i</m:t>
-              </m:r>
-              <m:r>
-                <m:t>o</m:t>
-              </m:r>
-              <m:r>
-                <m:t>n</m:t>
+                <m:t>callable union</m:t>
               </m:r>
             </m:e>
           </m:d>
@@ -10266,10 +8632,7 @@
         <w:pStyle w:val="FirstParagraph"/>
       </w:pPr>
       <w:r>
-        <w:t xml:space="preserve">将</w:t>
-      </w:r>
-      <w:r>
-        <w:t xml:space="preserve"> </w:t>
+        <w:t xml:space="preserve">将 </w:t>
       </w:r>
       <m:oMath>
         <m:r>
@@ -10277,10 +8640,7 @@
         </m:r>
       </m:oMath>
       <w:r>
-        <w:t xml:space="preserve"> </w:t>
-      </w:r>
-      <w:r>
-        <w:t xml:space="preserve">与 interval TSV 中 projected TE 的 genome-coordinate union 逐区间比较。该比较排除 GAF 未覆盖区，适用于 PGGB 和 minigraph。node-local TE fraction 是图中唯一节点序列的覆盖率，不等于任何线性基因组的 RepeatMasker mask rate。</w:t>
+        <w:t xml:space="preserve"> 与 interval TSV 中 projected TE 的 genome-coordinate union 逐区间比较。该比较排除 GAF 未覆盖区，适用于 PGGB 和 minigraph。node-local TE fraction 是图中唯一节点序列的覆盖率，不等于任何线性基因组的 RepeatMasker mask rate。</w:t>
       </w:r>
     </w:p>
     <w:bookmarkEnd w:id="69"/>
@@ -10297,8 +8657,6 @@
       </w:r>
       <w:r>
         <w:tab/>
-      </w:r>
-      <w:r>
         <w:t xml:space="preserve">12.3 重复库验证</w:t>
       </w:r>
     </w:p>
@@ -10325,8 +8683,6 @@
       </w:r>
       <w:r>
         <w:tab/>
-      </w:r>
-      <w:r>
         <w:t xml:space="preserve">13. 拟南芥验证数据摘要</w:t>
       </w:r>
     </w:p>
@@ -10343,8 +8699,6 @@
       </w:r>
       <w:r>
         <w:tab/>
-      </w:r>
-      <w:r>
         <w:t xml:space="preserve">13.1 GFA 注释</w:t>
       </w:r>
     </w:p>
@@ -10353,10 +8707,7 @@
         <w:pStyle w:val="FirstParagraph"/>
       </w:pPr>
       <w:r>
-        <w:t xml:space="preserve">PGGB Chr1 图含 2,270,366 nodes、3,144,225 个</w:t>
-      </w:r>
-      <w:r>
-        <w:t xml:space="preserve"> </w:t>
+        <w:t xml:space="preserve">PGGB Chr1 图含 2,270,366 nodes、3,144,225 个 </w:t>
       </w:r>
       <w:r>
         <w:rPr>
@@ -10365,10 +8716,7 @@
         <w:t xml:space="preserve">0M</w:t>
       </w:r>
       <w:r>
-        <w:t xml:space="preserve"> </w:t>
-      </w:r>
-      <w:r>
-        <w:t xml:space="preserve">links 和 7 条 P paths。7 套 RepeatMasker 输入共 800,587 features，恢复 17,011,115 occurrences，投影 12,150,687 intervals，unresolved 为 0。节点状态为 TE 853,457、PartialTE 10,872、Mixed 33,237、NonTE 1,372,800。7 个样本的 projected TE genome union 与源 Chr1 TE union 逐 bp 一致。</w:t>
+        <w:t xml:space="preserve"> links 和 7 条 P paths。7 套 RepeatMasker 输入共 800,587 features，恢复 17,011,115 occurrences，投影 12,150,687 intervals，unresolved 为 0。节点状态为 TE 853,457、PartialTE 10,872、Mixed 33,237、NonTE 1,372,800。7 个样本的 projected TE genome union 与源 Chr1 TE union 逐 bp 一致。</w:t>
       </w:r>
     </w:p>
     <w:p>
@@ -10376,10 +8724,7 @@
         <w:pStyle w:val="BodyText"/>
       </w:pPr>
       <w:r>
-        <w:t xml:space="preserve">minigraph</w:t>
-      </w:r>
-      <w:r>
-        <w:t xml:space="preserve"> </w:t>
+        <w:t xml:space="preserve">minigraph </w:t>
       </w:r>
       <w:r>
         <w:rPr>
@@ -10388,10 +8733,7 @@
         <w:t xml:space="preserve">Ara.gfa</w:t>
       </w:r>
       <w:r>
-        <w:t xml:space="preserve"> </w:t>
-      </w:r>
-      <w:r>
-        <w:t xml:space="preserve">含 74,660 nodes、总 node sequence 166,090,619 bp。1,376 条 primary GAF 均通过结构验证；默认质量门槛投影 521 条记录，其中 295 条 coordinate walk、226 条 named path，855 条质量不足记录不进入 occurrence。结果含 868,506 CIGAR match runs、1,179,408 occurrence blocks、1,133,307 projected intervals，unresolved 为 0。节点状态为 TE 24,596、PartialTE 17,621、Mixed 5,383、NonTE 27,060。node-local TE union 为 66,307,931 bp，占唯一 node sequence 的 39.9227%。</w:t>
+        <w:t xml:space="preserve"> 含 74,660 nodes、总 node sequence 166,090,619 bp。1,376 条 primary GAF 均通过结构验证；默认质量门槛投影 521 条记录，其中 295 条 coordinate walk、226 条 named path，855 条质量不足记录不进入 occurrence。结果含 868,506 CIGAR match runs、1,179,408 occurrence blocks、1,133,307 projected intervals，unresolved 为 0。节点状态为 TE 24,596、PartialTE 17,621、Mixed 5,383、NonTE 27,060。node-local TE union 为 66,307,931 bp，占唯一 node sequence 的 39.9227%。</w:t>
       </w:r>
     </w:p>
     <w:p>
@@ -10408,10 +8750,7 @@
         <w:t xml:space="preserve">source TE union ∩ callable union</w:t>
       </w:r>
       <w:r>
-        <w:t xml:space="preserve"> </w:t>
-      </w:r>
-      <w:r>
-        <w:t xml:space="preserve">与 projected TE union 完全一致。</w:t>
+        <w:t xml:space="preserve"> 与 projected TE union 完全一致。</w:t>
       </w:r>
     </w:p>
     <w:bookmarkEnd w:id="72"/>
@@ -10428,8 +8767,6 @@
       </w:r>
       <w:r>
         <w:tab/>
-      </w:r>
-      <w:r>
         <w:t xml:space="preserve">13.2 TE-looker 生产库和边界 refinement</w:t>
       </w:r>
     </w:p>
@@ -10464,8 +8801,6 @@
       </w:r>
       <w:r>
         <w:tab/>
-      </w:r>
-      <w:r>
         <w:t xml:space="preserve">14. 结果解释边界</w:t>
       </w:r>
     </w:p>
@@ -10502,10 +8837,7 @@
         </w:numPr>
       </w:pPr>
       <w:r>
-        <w:t xml:space="preserve">PGGB allele 依赖完整 P/W path 和稳定参考锚链；rGFA absence 依赖完整 spanning GAF，未观察为</w:t>
-      </w:r>
-      <w:r>
-        <w:t xml:space="preserve"> </w:t>
+        <w:t xml:space="preserve">PGGB allele 依赖完整 P/W path 和稳定参考锚链；rGFA absence 依赖完整 spanning GAF，未观察为 </w:t>
       </w:r>
       <w:r>
         <w:rPr>
@@ -10612,8 +8944,6 @@
       </w:r>
       <w:r>
         <w:tab/>
-      </w:r>
-      <w:r>
         <w:t xml:space="preserve">15. 论文 Methods 写作映射</w:t>
       </w:r>
     </w:p>
@@ -10998,8 +9328,6 @@
       </w:r>
       <w:r>
         <w:tab/>
-      </w:r>
-      <w:r>
         <w:t xml:space="preserve">16. 代码与输出溯源索引</w:t>
       </w:r>
     </w:p>
@@ -12038,7 +10366,7 @@
       <w:outlineLvl w:val="0"/>
     </w:pPr>
     <w:rPr>
-      <w:rFonts w:ascii="Times New Roman" w:hAnsi="Times New Roman" w:cs="Times New Roman" w:eastAsia="SimHei"/>
+      <w:rFonts w:ascii="Times New Roman" w:hAnsi="Times New Roman" w:cs="Times New Roman" w:eastAsia="SimSun"/>
       <w:b/>
       <w:bCs/>
       <w:color w:val="000000"/>
@@ -12060,7 +10388,7 @@
       <w:outlineLvl w:val="1"/>
     </w:pPr>
     <w:rPr>
-      <w:rFonts w:ascii="Times New Roman" w:hAnsi="Times New Roman" w:cs="Times New Roman" w:eastAsia="SimHei"/>
+      <w:rFonts w:ascii="Times New Roman" w:hAnsi="Times New Roman" w:cs="Times New Roman" w:eastAsia="SimSun"/>
       <w:b/>
       <w:bCs/>
       <w:color w:val="000000"/>
@@ -12082,7 +10410,7 @@
       <w:outlineLvl w:val="2"/>
     </w:pPr>
     <w:rPr>
-      <w:rFonts w:ascii="Times New Roman" w:hAnsi="Times New Roman" w:cs="Times New Roman" w:eastAsia="SimHei"/>
+      <w:rFonts w:ascii="Times New Roman" w:hAnsi="Times New Roman" w:cs="Times New Roman" w:eastAsia="SimSun"/>
       <w:b/>
       <w:bCs/>
       <w:color w:val="000000"/>
@@ -12104,7 +10432,7 @@
       <w:outlineLvl w:val="3"/>
     </w:pPr>
     <w:rPr>
-      <w:rFonts w:ascii="Times New Roman" w:hAnsi="Times New Roman" w:cs="Times New Roman" w:eastAsia="SimHei"/>
+      <w:rFonts w:ascii="Times New Roman" w:hAnsi="Times New Roman" w:cs="Times New Roman" w:eastAsia="SimSun"/>
       <w:bCs/>
       <w:color w:val="000000"/>
       <w:sz w:val="24"/>

</xml_diff>